<commit_message>
docs: update design decisions
</commit_message>
<xml_diff>
--- a/docs/DESIGN_DECISIONS.docx
+++ b/docs/DESIGN_DECISIONS.docx
@@ -1781,6 +1781,1305 @@
     </w:tbl>
     <w:p>
       <w:pPr>
+        <w:spacing w:before="120" w:after="80"/>
+      </w:pPr>
+    </w:p>
+    <w:p>
+      <w:pPr>
+        <w:pStyle w:val="Heading2"/>
+        <w:spacing w:before="200" w:after="80"/>
+      </w:pPr>
+      <w:r>
+        <w:rPr>
+          <w:b/>
+          <w:bCs/>
+          <w:color w:val="2563EB"/>
+          <w:sz w:val="24"/>
+          <w:szCs w:val="24"/>
+        </w:rPr>
+        <w:t xml:space="preserve">1.3 API Endpoints</w:t>
+      </w:r>
+    </w:p>
+    <w:tbl>
+      <w:tblPr>
+        <w:tblW w:type="dxa" w:w="9360"/>
+        <w:tblBorders>
+          <w:top w:val="single" w:color="auto" w:sz="4"/>
+          <w:left w:val="single" w:color="auto" w:sz="4"/>
+          <w:bottom w:val="single" w:color="auto" w:sz="4"/>
+          <w:right w:val="single" w:color="auto" w:sz="4"/>
+          <w:insideH w:val="single" w:color="auto" w:sz="4"/>
+          <w:insideV w:val="single" w:color="auto" w:sz="4"/>
+        </w:tblBorders>
+      </w:tblPr>
+      <w:tblGrid>
+        <w:gridCol w:w="2400"/>
+        <w:gridCol w:w="2000"/>
+        <w:gridCol w:w="4960"/>
+      </w:tblGrid>
+      <w:tr>
+        <w:tc>
+          <w:tcPr>
+            <w:tcW w:type="dxa" w:w="2400"/>
+            <w:tcBorders>
+              <w:top w:val="single" w:color="1E3A5F" w:sz="1"/>
+              <w:left w:val="single" w:color="1E3A5F" w:sz="1"/>
+              <w:bottom w:val="single" w:color="1E3A5F" w:sz="1"/>
+              <w:right w:val="single" w:color="1E3A5F" w:sz="1"/>
+            </w:tcBorders>
+            <w:shd w:fill="1E3A5F" w:val="clear"/>
+            <w:tcMar>
+              <w:top w:type="dxa" w:w="80"/>
+              <w:left w:type="dxa" w:w="120"/>
+              <w:bottom w:type="dxa" w:w="80"/>
+              <w:right w:type="dxa" w:w="120"/>
+            </w:tcMar>
+          </w:tcPr>
+          <w:p>
+            <w:r>
+              <w:rPr>
+                <w:b/>
+                <w:bCs/>
+                <w:color w:val="FFFFFF"/>
+                <w:sz w:val="21"/>
+                <w:szCs w:val="21"/>
+              </w:rPr>
+              <w:t xml:space="preserve">Endpoint</w:t>
+            </w:r>
+          </w:p>
+        </w:tc>
+        <w:tc>
+          <w:tcPr>
+            <w:tcW w:type="dxa" w:w="2000"/>
+            <w:tcBorders>
+              <w:top w:val="single" w:color="1E3A5F" w:sz="1"/>
+              <w:left w:val="single" w:color="1E3A5F" w:sz="1"/>
+              <w:bottom w:val="single" w:color="1E3A5F" w:sz="1"/>
+              <w:right w:val="single" w:color="1E3A5F" w:sz="1"/>
+            </w:tcBorders>
+            <w:shd w:fill="1E3A5F" w:val="clear"/>
+            <w:tcMar>
+              <w:top w:type="dxa" w:w="80"/>
+              <w:left w:type="dxa" w:w="120"/>
+              <w:bottom w:type="dxa" w:w="80"/>
+              <w:right w:type="dxa" w:w="120"/>
+            </w:tcMar>
+          </w:tcPr>
+          <w:p>
+            <w:r>
+              <w:rPr>
+                <w:b/>
+                <w:bCs/>
+                <w:color w:val="FFFFFF"/>
+                <w:sz w:val="21"/>
+                <w:szCs w:val="21"/>
+              </w:rPr>
+              <w:t xml:space="preserve">Method</w:t>
+            </w:r>
+          </w:p>
+        </w:tc>
+        <w:tc>
+          <w:tcPr>
+            <w:tcW w:type="dxa" w:w="4960"/>
+            <w:tcBorders>
+              <w:top w:val="single" w:color="1E3A5F" w:sz="1"/>
+              <w:left w:val="single" w:color="1E3A5F" w:sz="1"/>
+              <w:bottom w:val="single" w:color="1E3A5F" w:sz="1"/>
+              <w:right w:val="single" w:color="1E3A5F" w:sz="1"/>
+            </w:tcBorders>
+            <w:shd w:fill="1E3A5F" w:val="clear"/>
+            <w:tcMar>
+              <w:top w:type="dxa" w:w="80"/>
+              <w:left w:type="dxa" w:w="120"/>
+              <w:bottom w:type="dxa" w:w="80"/>
+              <w:right w:type="dxa" w:w="120"/>
+            </w:tcMar>
+          </w:tcPr>
+          <w:p>
+            <w:r>
+              <w:rPr>
+                <w:b/>
+                <w:bCs/>
+                <w:color w:val="FFFFFF"/>
+                <w:sz w:val="21"/>
+                <w:szCs w:val="21"/>
+              </w:rPr>
+              <w:t xml:space="preserve">Example Request / Response</w:t>
+            </w:r>
+          </w:p>
+        </w:tc>
+      </w:tr>
+      <w:tr>
+        <w:tc>
+          <w:tcPr>
+            <w:tcW w:type="dxa" w:w="2400"/>
+            <w:tcBorders>
+              <w:top w:val="single" w:color="CCCCCC" w:sz="1"/>
+              <w:left w:val="single" w:color="CCCCCC" w:sz="1"/>
+              <w:bottom w:val="single" w:color="CCCCCC" w:sz="1"/>
+              <w:right w:val="single" w:color="CCCCCC" w:sz="1"/>
+            </w:tcBorders>
+            <w:shd w:fill="F9FAFB" w:val="clear"/>
+            <w:tcMar>
+              <w:top w:type="dxa" w:w="80"/>
+              <w:left w:type="dxa" w:w="120"/>
+              <w:bottom w:type="dxa" w:w="80"/>
+              <w:right w:type="dxa" w:w="120"/>
+            </w:tcMar>
+          </w:tcPr>
+          <w:p>
+            <w:r>
+              <w:rPr>
+                <w:sz w:val="21"/>
+                <w:szCs w:val="21"/>
+              </w:rPr>
+              <w:t xml:space="preserve">GET /health</w:t>
+            </w:r>
+          </w:p>
+        </w:tc>
+        <w:tc>
+          <w:tcPr>
+            <w:tcW w:type="dxa" w:w="2000"/>
+            <w:tcBorders>
+              <w:top w:val="single" w:color="CCCCCC" w:sz="1"/>
+              <w:left w:val="single" w:color="CCCCCC" w:sz="1"/>
+              <w:bottom w:val="single" w:color="CCCCCC" w:sz="1"/>
+              <w:right w:val="single" w:color="CCCCCC" w:sz="1"/>
+            </w:tcBorders>
+            <w:shd w:fill="F9FAFB" w:val="clear"/>
+            <w:tcMar>
+              <w:top w:type="dxa" w:w="80"/>
+              <w:left w:type="dxa" w:w="120"/>
+              <w:bottom w:type="dxa" w:w="80"/>
+              <w:right w:type="dxa" w:w="120"/>
+            </w:tcMar>
+          </w:tcPr>
+          <w:p>
+            <w:r>
+              <w:rPr>
+                <w:sz w:val="21"/>
+                <w:szCs w:val="21"/>
+              </w:rPr>
+              <w:t xml:space="preserve">200 OK</w:t>
+            </w:r>
+          </w:p>
+        </w:tc>
+        <w:tc>
+          <w:tcPr>
+            <w:tcW w:type="dxa" w:w="4960"/>
+            <w:tcBorders>
+              <w:top w:val="single" w:color="CCCCCC" w:sz="1"/>
+              <w:left w:val="single" w:color="CCCCCC" w:sz="1"/>
+              <w:bottom w:val="single" w:color="CCCCCC" w:sz="1"/>
+              <w:right w:val="single" w:color="CCCCCC" w:sz="1"/>
+            </w:tcBorders>
+            <w:shd w:fill="F9FAFB" w:val="clear"/>
+            <w:tcMar>
+              <w:top w:type="dxa" w:w="80"/>
+              <w:left w:type="dxa" w:w="120"/>
+              <w:bottom w:type="dxa" w:w="80"/>
+              <w:right w:type="dxa" w:w="120"/>
+            </w:tcMar>
+          </w:tcPr>
+          <w:p>
+            <w:pPr>
+              <w:spacing w:before="20" w:after="20"/>
+            </w:pPr>
+            <w:r>
+              <w:rPr>
+                <w:rFonts w:ascii="Arial" w:cs="Arial" w:eastAsia="Arial" w:hAnsi="Arial"/>
+                <w:color w:val="111827"/>
+                <w:sz w:val="20"/>
+                <w:szCs w:val="20"/>
+              </w:rPr>
+              <w:t xml:space="preserve">{"status":"ok","timestamp":"2026-03-17T00:07:29Z"}</w:t>
+            </w:r>
+          </w:p>
+        </w:tc>
+      </w:tr>
+      <w:tr>
+        <w:tc>
+          <w:tcPr>
+            <w:tcW w:type="dxa" w:w="2400"/>
+            <w:tcBorders>
+              <w:top w:val="single" w:color="CCCCCC" w:sz="1"/>
+              <w:left w:val="single" w:color="CCCCCC" w:sz="1"/>
+              <w:bottom w:val="single" w:color="CCCCCC" w:sz="1"/>
+              <w:right w:val="single" w:color="CCCCCC" w:sz="1"/>
+            </w:tcBorders>
+            <w:shd w:fill="FFFFFF" w:val="clear"/>
+            <w:tcMar>
+              <w:top w:type="dxa" w:w="80"/>
+              <w:left w:type="dxa" w:w="120"/>
+              <w:bottom w:type="dxa" w:w="80"/>
+              <w:right w:type="dxa" w:w="120"/>
+            </w:tcMar>
+          </w:tcPr>
+          <w:p>
+            <w:r>
+              <w:rPr>
+                <w:sz w:val="21"/>
+                <w:szCs w:val="21"/>
+              </w:rPr>
+              <w:t xml:space="preserve">GET /funds?category=Equity Scheme - Mid Cap Fund</w:t>
+            </w:r>
+          </w:p>
+        </w:tc>
+        <w:tc>
+          <w:tcPr>
+            <w:tcW w:type="dxa" w:w="2000"/>
+            <w:tcBorders>
+              <w:top w:val="single" w:color="CCCCCC" w:sz="1"/>
+              <w:left w:val="single" w:color="CCCCCC" w:sz="1"/>
+              <w:bottom w:val="single" w:color="CCCCCC" w:sz="1"/>
+              <w:right w:val="single" w:color="CCCCCC" w:sz="1"/>
+            </w:tcBorders>
+            <w:shd w:fill="FFFFFF" w:val="clear"/>
+            <w:tcMar>
+              <w:top w:type="dxa" w:w="80"/>
+              <w:left w:type="dxa" w:w="120"/>
+              <w:bottom w:type="dxa" w:w="80"/>
+              <w:right w:type="dxa" w:w="120"/>
+            </w:tcMar>
+          </w:tcPr>
+          <w:p>
+            <w:r>
+              <w:rPr>
+                <w:sz w:val="21"/>
+                <w:szCs w:val="21"/>
+              </w:rPr>
+              <w:t xml:space="preserve">200 OK</w:t>
+            </w:r>
+          </w:p>
+        </w:tc>
+        <w:tc>
+          <w:tcPr>
+            <w:tcW w:type="dxa" w:w="4960"/>
+            <w:tcBorders>
+              <w:top w:val="single" w:color="CCCCCC" w:sz="1"/>
+              <w:left w:val="single" w:color="CCCCCC" w:sz="1"/>
+              <w:bottom w:val="single" w:color="CCCCCC" w:sz="1"/>
+              <w:right w:val="single" w:color="CCCCCC" w:sz="1"/>
+            </w:tcBorders>
+            <w:shd w:fill="FFFFFF" w:val="clear"/>
+            <w:tcMar>
+              <w:top w:type="dxa" w:w="80"/>
+              <w:left w:type="dxa" w:w="120"/>
+              <w:bottom w:type="dxa" w:w="80"/>
+              <w:right w:type="dxa" w:w="120"/>
+            </w:tcMar>
+          </w:tcPr>
+          <w:p>
+            <w:pPr>
+              <w:spacing w:before="20" w:after="20"/>
+            </w:pPr>
+            <w:r>
+              <w:rPr>
+                <w:rFonts w:ascii="Arial" w:cs="Arial" w:eastAsia="Arial" w:hAnsi="Arial"/>
+                <w:color w:val="111827"/>
+                <w:sz w:val="20"/>
+                <w:szCs w:val="20"/>
+              </w:rPr>
+              <w:t xml:space="preserve">{"funds":[{"SchemeCode":"118989","FundName":"HDFC Mid Cap...","CurrentNAV":123.45}],"count":5}</w:t>
+            </w:r>
+          </w:p>
+        </w:tc>
+      </w:tr>
+      <w:tr>
+        <w:tc>
+          <w:tcPr>
+            <w:tcW w:type="dxa" w:w="2400"/>
+            <w:tcBorders>
+              <w:top w:val="single" w:color="CCCCCC" w:sz="1"/>
+              <w:left w:val="single" w:color="CCCCCC" w:sz="1"/>
+              <w:bottom w:val="single" w:color="CCCCCC" w:sz="1"/>
+              <w:right w:val="single" w:color="CCCCCC" w:sz="1"/>
+            </w:tcBorders>
+            <w:shd w:fill="F9FAFB" w:val="clear"/>
+            <w:tcMar>
+              <w:top w:type="dxa" w:w="80"/>
+              <w:left w:type="dxa" w:w="120"/>
+              <w:bottom w:type="dxa" w:w="80"/>
+              <w:right w:type="dxa" w:w="120"/>
+            </w:tcMar>
+          </w:tcPr>
+          <w:p>
+            <w:r>
+              <w:rPr>
+                <w:sz w:val="21"/>
+                <w:szCs w:val="21"/>
+              </w:rPr>
+              <w:t xml:space="preserve">GET /funds/120381</w:t>
+            </w:r>
+          </w:p>
+        </w:tc>
+        <w:tc>
+          <w:tcPr>
+            <w:tcW w:type="dxa" w:w="2000"/>
+            <w:tcBorders>
+              <w:top w:val="single" w:color="CCCCCC" w:sz="1"/>
+              <w:left w:val="single" w:color="CCCCCC" w:sz="1"/>
+              <w:bottom w:val="single" w:color="CCCCCC" w:sz="1"/>
+              <w:right w:val="single" w:color="CCCCCC" w:sz="1"/>
+            </w:tcBorders>
+            <w:shd w:fill="F9FAFB" w:val="clear"/>
+            <w:tcMar>
+              <w:top w:type="dxa" w:w="80"/>
+              <w:left w:type="dxa" w:w="120"/>
+              <w:bottom w:type="dxa" w:w="80"/>
+              <w:right w:type="dxa" w:w="120"/>
+            </w:tcMar>
+          </w:tcPr>
+          <w:p>
+            <w:r>
+              <w:rPr>
+                <w:sz w:val="21"/>
+                <w:szCs w:val="21"/>
+              </w:rPr>
+              <w:t xml:space="preserve">200 OK</w:t>
+            </w:r>
+          </w:p>
+        </w:tc>
+        <w:tc>
+          <w:tcPr>
+            <w:tcW w:type="dxa" w:w="4960"/>
+            <w:tcBorders>
+              <w:top w:val="single" w:color="CCCCCC" w:sz="1"/>
+              <w:left w:val="single" w:color="CCCCCC" w:sz="1"/>
+              <w:bottom w:val="single" w:color="CCCCCC" w:sz="1"/>
+              <w:right w:val="single" w:color="CCCCCC" w:sz="1"/>
+            </w:tcBorders>
+            <w:shd w:fill="F9FAFB" w:val="clear"/>
+            <w:tcMar>
+              <w:top w:type="dxa" w:w="80"/>
+              <w:left w:type="dxa" w:w="120"/>
+              <w:bottom w:type="dxa" w:w="80"/>
+              <w:right w:type="dxa" w:w="120"/>
+            </w:tcMar>
+          </w:tcPr>
+          <w:p>
+            <w:pPr>
+              <w:spacing w:before="20" w:after="20"/>
+            </w:pPr>
+            <w:r>
+              <w:rPr>
+                <w:rFonts w:ascii="Arial" w:cs="Arial" w:eastAsia="Arial" w:hAnsi="Arial"/>
+                <w:color w:val="111827"/>
+                <w:sz w:val="20"/>
+                <w:szCs w:val="20"/>
+              </w:rPr>
+              <w:t xml:space="preserve">{"scheme_code":"120381","fund_name":"ICICI Prudential MidCap...","amc":"ICICI Prudential","category":"Equity Scheme - Mid Cap Fund","current_nav":289.45,"last_updated":"2026-03-13"}</w:t>
+            </w:r>
+          </w:p>
+        </w:tc>
+      </w:tr>
+      <w:tr>
+        <w:tc>
+          <w:tcPr>
+            <w:tcW w:type="dxa" w:w="2400"/>
+            <w:tcBorders>
+              <w:top w:val="single" w:color="CCCCCC" w:sz="1"/>
+              <w:left w:val="single" w:color="CCCCCC" w:sz="1"/>
+              <w:bottom w:val="single" w:color="CCCCCC" w:sz="1"/>
+              <w:right w:val="single" w:color="CCCCCC" w:sz="1"/>
+            </w:tcBorders>
+            <w:shd w:fill="FFFFFF" w:val="clear"/>
+            <w:tcMar>
+              <w:top w:type="dxa" w:w="80"/>
+              <w:left w:type="dxa" w:w="120"/>
+              <w:bottom w:type="dxa" w:w="80"/>
+              <w:right w:type="dxa" w:w="120"/>
+            </w:tcMar>
+          </w:tcPr>
+          <w:p>
+            <w:r>
+              <w:rPr>
+                <w:sz w:val="21"/>
+                <w:szCs w:val="21"/>
+              </w:rPr>
+              <w:t xml:space="preserve">GET /funds/999999</w:t>
+            </w:r>
+          </w:p>
+        </w:tc>
+        <w:tc>
+          <w:tcPr>
+            <w:tcW w:type="dxa" w:w="2000"/>
+            <w:tcBorders>
+              <w:top w:val="single" w:color="CCCCCC" w:sz="1"/>
+              <w:left w:val="single" w:color="CCCCCC" w:sz="1"/>
+              <w:bottom w:val="single" w:color="CCCCCC" w:sz="1"/>
+              <w:right w:val="single" w:color="CCCCCC" w:sz="1"/>
+            </w:tcBorders>
+            <w:shd w:fill="FFFFFF" w:val="clear"/>
+            <w:tcMar>
+              <w:top w:type="dxa" w:w="80"/>
+              <w:left w:type="dxa" w:w="120"/>
+              <w:bottom w:type="dxa" w:w="80"/>
+              <w:right w:type="dxa" w:w="120"/>
+            </w:tcMar>
+          </w:tcPr>
+          <w:p>
+            <w:r>
+              <w:rPr>
+                <w:sz w:val="21"/>
+                <w:szCs w:val="21"/>
+              </w:rPr>
+              <w:t xml:space="preserve">404</w:t>
+            </w:r>
+          </w:p>
+        </w:tc>
+        <w:tc>
+          <w:tcPr>
+            <w:tcW w:type="dxa" w:w="4960"/>
+            <w:tcBorders>
+              <w:top w:val="single" w:color="CCCCCC" w:sz="1"/>
+              <w:left w:val="single" w:color="CCCCCC" w:sz="1"/>
+              <w:bottom w:val="single" w:color="CCCCCC" w:sz="1"/>
+              <w:right w:val="single" w:color="CCCCCC" w:sz="1"/>
+            </w:tcBorders>
+            <w:shd w:fill="FFFFFF" w:val="clear"/>
+            <w:tcMar>
+              <w:top w:type="dxa" w:w="80"/>
+              <w:left w:type="dxa" w:w="120"/>
+              <w:bottom w:type="dxa" w:w="80"/>
+              <w:right w:type="dxa" w:w="120"/>
+            </w:tcMar>
+          </w:tcPr>
+          <w:p>
+            <w:pPr>
+              <w:spacing w:before="20" w:after="20"/>
+            </w:pPr>
+            <w:r>
+              <w:rPr>
+                <w:rFonts w:ascii="Arial" w:cs="Arial" w:eastAsia="Arial" w:hAnsi="Arial"/>
+                <w:color w:val="111827"/>
+                <w:sz w:val="20"/>
+                <w:szCs w:val="20"/>
+              </w:rPr>
+              <w:t xml:space="preserve">{"error":"fund 999999 not found"}</w:t>
+            </w:r>
+          </w:p>
+        </w:tc>
+      </w:tr>
+      <w:tr>
+        <w:tc>
+          <w:tcPr>
+            <w:tcW w:type="dxa" w:w="2400"/>
+            <w:tcBorders>
+              <w:top w:val="single" w:color="CCCCCC" w:sz="1"/>
+              <w:left w:val="single" w:color="CCCCCC" w:sz="1"/>
+              <w:bottom w:val="single" w:color="CCCCCC" w:sz="1"/>
+              <w:right w:val="single" w:color="CCCCCC" w:sz="1"/>
+            </w:tcBorders>
+            <w:shd w:fill="F9FAFB" w:val="clear"/>
+            <w:tcMar>
+              <w:top w:type="dxa" w:w="80"/>
+              <w:left w:type="dxa" w:w="120"/>
+              <w:bottom w:type="dxa" w:w="80"/>
+              <w:right w:type="dxa" w:w="120"/>
+            </w:tcMar>
+          </w:tcPr>
+          <w:p>
+            <w:r>
+              <w:rPr>
+                <w:sz w:val="21"/>
+                <w:szCs w:val="21"/>
+              </w:rPr>
+              <w:t xml:space="preserve">GET /funds/120381/analytics?window=3Y</w:t>
+            </w:r>
+          </w:p>
+        </w:tc>
+        <w:tc>
+          <w:tcPr>
+            <w:tcW w:type="dxa" w:w="2000"/>
+            <w:tcBorders>
+              <w:top w:val="single" w:color="CCCCCC" w:sz="1"/>
+              <w:left w:val="single" w:color="CCCCCC" w:sz="1"/>
+              <w:bottom w:val="single" w:color="CCCCCC" w:sz="1"/>
+              <w:right w:val="single" w:color="CCCCCC" w:sz="1"/>
+            </w:tcBorders>
+            <w:shd w:fill="F9FAFB" w:val="clear"/>
+            <w:tcMar>
+              <w:top w:type="dxa" w:w="80"/>
+              <w:left w:type="dxa" w:w="120"/>
+              <w:bottom w:type="dxa" w:w="80"/>
+              <w:right w:type="dxa" w:w="120"/>
+            </w:tcMar>
+          </w:tcPr>
+          <w:p>
+            <w:r>
+              <w:rPr>
+                <w:sz w:val="21"/>
+                <w:szCs w:val="21"/>
+              </w:rPr>
+              <w:t xml:space="preserve">200 OK</w:t>
+            </w:r>
+          </w:p>
+        </w:tc>
+        <w:tc>
+          <w:tcPr>
+            <w:tcW w:type="dxa" w:w="4960"/>
+            <w:tcBorders>
+              <w:top w:val="single" w:color="CCCCCC" w:sz="1"/>
+              <w:left w:val="single" w:color="CCCCCC" w:sz="1"/>
+              <w:bottom w:val="single" w:color="CCCCCC" w:sz="1"/>
+              <w:right w:val="single" w:color="CCCCCC" w:sz="1"/>
+            </w:tcBorders>
+            <w:shd w:fill="F9FAFB" w:val="clear"/>
+            <w:tcMar>
+              <w:top w:type="dxa" w:w="80"/>
+              <w:left w:type="dxa" w:w="120"/>
+              <w:bottom w:type="dxa" w:w="80"/>
+              <w:right w:type="dxa" w:w="120"/>
+            </w:tcMar>
+          </w:tcPr>
+          <w:p>
+            <w:pPr>
+              <w:spacing w:before="20" w:after="20"/>
+            </w:pPr>
+            <w:r>
+              <w:rPr>
+                <w:rFonts w:ascii="Arial" w:cs="Arial" w:eastAsia="Arial" w:hAnsi="Arial"/>
+                <w:color w:val="111827"/>
+                <w:sz w:val="20"/>
+                <w:szCs w:val="20"/>
+              </w:rPr>
+              <w:t xml:space="preserve">{"fund_code":"120381","fund_name":"ICICI Prudential MidCap...","window":"3Y",</w:t>
+            </w:r>
+          </w:p>
+          <w:p>
+            <w:pPr>
+              <w:spacing w:before="20" w:after="20"/>
+            </w:pPr>
+            <w:r>
+              <w:rPr>
+                <w:rFonts w:ascii="Courier New" w:cs="Courier New" w:eastAsia="Courier New" w:hAnsi="Courier New"/>
+                <w:color w:val="1F2937"/>
+                <w:sz w:val="20"/>
+                <w:szCs w:val="20"/>
+              </w:rPr>
+              <w:t xml:space="preserve"> "rolling_periods_analyzed":2532,</w:t>
+            </w:r>
+          </w:p>
+          <w:p>
+            <w:pPr>
+              <w:spacing w:before="20" w:after="20"/>
+            </w:pPr>
+            <w:r>
+              <w:rPr>
+                <w:rFonts w:ascii="Courier New" w:cs="Courier New" w:eastAsia="Courier New" w:hAnsi="Courier New"/>
+                <w:color w:val="1F2937"/>
+                <w:sz w:val="20"/>
+                <w:szCs w:val="20"/>
+              </w:rPr>
+              <w:t xml:space="preserve"> "rolling_returns":{"min":-26.88,"max":196.65,"median":75.18,"p25":44.63,"p75":99.85},</w:t>
+            </w:r>
+          </w:p>
+          <w:p>
+            <w:pPr>
+              <w:spacing w:before="20" w:after="20"/>
+            </w:pPr>
+            <w:r>
+              <w:rPr>
+                <w:rFonts w:ascii="Courier New" w:cs="Courier New" w:eastAsia="Courier New" w:hAnsi="Courier New"/>
+                <w:color w:val="1F2937"/>
+                <w:sz w:val="20"/>
+                <w:szCs w:val="20"/>
+              </w:rPr>
+              <w:t xml:space="preserve"> "max_drawdown":-44.04,</w:t>
+            </w:r>
+          </w:p>
+          <w:p>
+            <w:pPr>
+              <w:spacing w:before="20" w:after="20"/>
+            </w:pPr>
+            <w:r>
+              <w:rPr>
+                <w:rFonts w:ascii="Courier New" w:cs="Courier New" w:eastAsia="Courier New" w:hAnsi="Courier New"/>
+                <w:color w:val="1F2937"/>
+                <w:sz w:val="20"/>
+                <w:szCs w:val="20"/>
+              </w:rPr>
+              <w:t xml:space="preserve"> "cagr":{"min":-9.91,"max":43.73,"median":20.54},</w:t>
+            </w:r>
+          </w:p>
+          <w:p>
+            <w:pPr>
+              <w:spacing w:before="20" w:after="20"/>
+            </w:pPr>
+            <w:r>
+              <w:rPr>
+                <w:rFonts w:ascii="Courier New" w:cs="Courier New" w:eastAsia="Courier New" w:hAnsi="Courier New"/>
+                <w:color w:val="1F2937"/>
+                <w:sz w:val="20"/>
+                <w:szCs w:val="20"/>
+              </w:rPr>
+              <w:t xml:space="preserve"> "computed_at":"2026-03-17T00:05:21Z"}</w:t>
+            </w:r>
+          </w:p>
+        </w:tc>
+      </w:tr>
+      <w:tr>
+        <w:tc>
+          <w:tcPr>
+            <w:tcW w:type="dxa" w:w="2400"/>
+            <w:tcBorders>
+              <w:top w:val="single" w:color="CCCCCC" w:sz="1"/>
+              <w:left w:val="single" w:color="CCCCCC" w:sz="1"/>
+              <w:bottom w:val="single" w:color="CCCCCC" w:sz="1"/>
+              <w:right w:val="single" w:color="CCCCCC" w:sz="1"/>
+            </w:tcBorders>
+            <w:shd w:fill="FFFFFF" w:val="clear"/>
+            <w:tcMar>
+              <w:top w:type="dxa" w:w="80"/>
+              <w:left w:type="dxa" w:w="120"/>
+              <w:bottom w:type="dxa" w:w="80"/>
+              <w:right w:type="dxa" w:w="120"/>
+            </w:tcMar>
+          </w:tcPr>
+          <w:p>
+            <w:r>
+              <w:rPr>
+                <w:sz w:val="21"/>
+                <w:szCs w:val="21"/>
+              </w:rPr>
+              <w:t xml:space="preserve">GET /funds/120381/analytics (missing window)</w:t>
+            </w:r>
+          </w:p>
+        </w:tc>
+        <w:tc>
+          <w:tcPr>
+            <w:tcW w:type="dxa" w:w="2000"/>
+            <w:tcBorders>
+              <w:top w:val="single" w:color="CCCCCC" w:sz="1"/>
+              <w:left w:val="single" w:color="CCCCCC" w:sz="1"/>
+              <w:bottom w:val="single" w:color="CCCCCC" w:sz="1"/>
+              <w:right w:val="single" w:color="CCCCCC" w:sz="1"/>
+            </w:tcBorders>
+            <w:shd w:fill="FFFFFF" w:val="clear"/>
+            <w:tcMar>
+              <w:top w:type="dxa" w:w="80"/>
+              <w:left w:type="dxa" w:w="120"/>
+              <w:bottom w:type="dxa" w:w="80"/>
+              <w:right w:type="dxa" w:w="120"/>
+            </w:tcMar>
+          </w:tcPr>
+          <w:p>
+            <w:r>
+              <w:rPr>
+                <w:sz w:val="21"/>
+                <w:szCs w:val="21"/>
+              </w:rPr>
+              <w:t xml:space="preserve">400</w:t>
+            </w:r>
+          </w:p>
+        </w:tc>
+        <w:tc>
+          <w:tcPr>
+            <w:tcW w:type="dxa" w:w="4960"/>
+            <w:tcBorders>
+              <w:top w:val="single" w:color="CCCCCC" w:sz="1"/>
+              <w:left w:val="single" w:color="CCCCCC" w:sz="1"/>
+              <w:bottom w:val="single" w:color="CCCCCC" w:sz="1"/>
+              <w:right w:val="single" w:color="CCCCCC" w:sz="1"/>
+            </w:tcBorders>
+            <w:shd w:fill="FFFFFF" w:val="clear"/>
+            <w:tcMar>
+              <w:top w:type="dxa" w:w="80"/>
+              <w:left w:type="dxa" w:w="120"/>
+              <w:bottom w:type="dxa" w:w="80"/>
+              <w:right w:type="dxa" w:w="120"/>
+            </w:tcMar>
+          </w:tcPr>
+          <w:p>
+            <w:pPr>
+              <w:spacing w:before="20" w:after="20"/>
+            </w:pPr>
+            <w:r>
+              <w:rPr>
+                <w:rFonts w:ascii="Arial" w:cs="Arial" w:eastAsia="Arial" w:hAnsi="Arial"/>
+                <w:color w:val="111827"/>
+                <w:sz w:val="20"/>
+                <w:szCs w:val="20"/>
+              </w:rPr>
+              <w:t xml:space="preserve">{"error":"window is required (1Y/3Y/5Y/10Y)"}</w:t>
+            </w:r>
+          </w:p>
+        </w:tc>
+      </w:tr>
+      <w:tr>
+        <w:tc>
+          <w:tcPr>
+            <w:tcW w:type="dxa" w:w="2400"/>
+            <w:tcBorders>
+              <w:top w:val="single" w:color="CCCCCC" w:sz="1"/>
+              <w:left w:val="single" w:color="CCCCCC" w:sz="1"/>
+              <w:bottom w:val="single" w:color="CCCCCC" w:sz="1"/>
+              <w:right w:val="single" w:color="CCCCCC" w:sz="1"/>
+            </w:tcBorders>
+            <w:shd w:fill="F9FAFB" w:val="clear"/>
+            <w:tcMar>
+              <w:top w:type="dxa" w:w="80"/>
+              <w:left w:type="dxa" w:w="120"/>
+              <w:bottom w:type="dxa" w:w="80"/>
+              <w:right w:type="dxa" w:w="120"/>
+            </w:tcMar>
+          </w:tcPr>
+          <w:p>
+            <w:r>
+              <w:rPr>
+                <w:sz w:val="21"/>
+                <w:szCs w:val="21"/>
+              </w:rPr>
+              <w:t xml:space="preserve">GET /funds/rank?category=Equity Scheme - Mid Cap Fund&amp;window=3Y&amp;sort_by=median_return&amp;limit=2</w:t>
+            </w:r>
+          </w:p>
+        </w:tc>
+        <w:tc>
+          <w:tcPr>
+            <w:tcW w:type="dxa" w:w="2000"/>
+            <w:tcBorders>
+              <w:top w:val="single" w:color="CCCCCC" w:sz="1"/>
+              <w:left w:val="single" w:color="CCCCCC" w:sz="1"/>
+              <w:bottom w:val="single" w:color="CCCCCC" w:sz="1"/>
+              <w:right w:val="single" w:color="CCCCCC" w:sz="1"/>
+            </w:tcBorders>
+            <w:shd w:fill="F9FAFB" w:val="clear"/>
+            <w:tcMar>
+              <w:top w:type="dxa" w:w="80"/>
+              <w:left w:type="dxa" w:w="120"/>
+              <w:bottom w:type="dxa" w:w="80"/>
+              <w:right w:type="dxa" w:w="120"/>
+            </w:tcMar>
+          </w:tcPr>
+          <w:p>
+            <w:r>
+              <w:rPr>
+                <w:sz w:val="21"/>
+                <w:szCs w:val="21"/>
+              </w:rPr>
+              <w:t xml:space="preserve">200 OK</w:t>
+            </w:r>
+          </w:p>
+        </w:tc>
+        <w:tc>
+          <w:tcPr>
+            <w:tcW w:type="dxa" w:w="4960"/>
+            <w:tcBorders>
+              <w:top w:val="single" w:color="CCCCCC" w:sz="1"/>
+              <w:left w:val="single" w:color="CCCCCC" w:sz="1"/>
+              <w:bottom w:val="single" w:color="CCCCCC" w:sz="1"/>
+              <w:right w:val="single" w:color="CCCCCC" w:sz="1"/>
+            </w:tcBorders>
+            <w:shd w:fill="F9FAFB" w:val="clear"/>
+            <w:tcMar>
+              <w:top w:type="dxa" w:w="80"/>
+              <w:left w:type="dxa" w:w="120"/>
+              <w:bottom w:type="dxa" w:w="80"/>
+              <w:right w:type="dxa" w:w="120"/>
+            </w:tcMar>
+          </w:tcPr>
+          <w:p>
+            <w:pPr>
+              <w:spacing w:before="20" w:after="20"/>
+            </w:pPr>
+            <w:r>
+              <w:rPr>
+                <w:rFonts w:ascii="Arial" w:cs="Arial" w:eastAsia="Arial" w:hAnsi="Arial"/>
+                <w:color w:val="111827"/>
+                <w:sz w:val="20"/>
+                <w:szCs w:val="20"/>
+              </w:rPr>
+              <w:t xml:space="preserve">{"category":"Equity Scheme - Mid Cap Fund","window":"3Y","sorted_by":"median_return","total_funds":5,"showing":2,</w:t>
+            </w:r>
+          </w:p>
+          <w:p>
+            <w:pPr>
+              <w:spacing w:before="20" w:after="20"/>
+            </w:pPr>
+            <w:r>
+              <w:rPr>
+                <w:rFonts w:ascii="Courier New" w:cs="Courier New" w:eastAsia="Courier New" w:hAnsi="Courier New"/>
+                <w:color w:val="1F2937"/>
+                <w:sz w:val="20"/>
+                <w:szCs w:val="20"/>
+              </w:rPr>
+              <w:t xml:space="preserve"> "funds":[{"rank":1,"fund_code":"118989","fund_name":"HDFC Mid Cap...","median_return":23.52,"max_drawdown":-39.51,"current_nav":125.30,"last_updated":"2026-03-13"},</w:t>
+            </w:r>
+          </w:p>
+          <w:p>
+            <w:pPr>
+              <w:spacing w:before="20" w:after="20"/>
+            </w:pPr>
+            <w:r>
+              <w:rPr>
+                <w:rFonts w:ascii="Courier New" w:cs="Courier New" w:eastAsia="Courier New" w:hAnsi="Courier New"/>
+                <w:color w:val="1F2937"/>
+                <w:sz w:val="20"/>
+                <w:szCs w:val="20"/>
+              </w:rPr>
+              <w:t xml:space="preserve">          {"rank":2,"fund_code":"119716","fund_name":"SBI MIDCAP...","median_return":20.61,...}]}</w:t>
+            </w:r>
+          </w:p>
+        </w:tc>
+      </w:tr>
+      <w:tr>
+        <w:tc>
+          <w:tcPr>
+            <w:tcW w:type="dxa" w:w="2400"/>
+            <w:tcBorders>
+              <w:top w:val="single" w:color="CCCCCC" w:sz="1"/>
+              <w:left w:val="single" w:color="CCCCCC" w:sz="1"/>
+              <w:bottom w:val="single" w:color="CCCCCC" w:sz="1"/>
+              <w:right w:val="single" w:color="CCCCCC" w:sz="1"/>
+            </w:tcBorders>
+            <w:shd w:fill="FFFFFF" w:val="clear"/>
+            <w:tcMar>
+              <w:top w:type="dxa" w:w="80"/>
+              <w:left w:type="dxa" w:w="120"/>
+              <w:bottom w:type="dxa" w:w="80"/>
+              <w:right w:type="dxa" w:w="120"/>
+            </w:tcMar>
+          </w:tcPr>
+          <w:p>
+            <w:r>
+              <w:rPr>
+                <w:sz w:val="21"/>
+                <w:szCs w:val="21"/>
+              </w:rPr>
+              <w:t xml:space="preserve">GET /funds/rank (missing category)</w:t>
+            </w:r>
+          </w:p>
+        </w:tc>
+        <w:tc>
+          <w:tcPr>
+            <w:tcW w:type="dxa" w:w="2000"/>
+            <w:tcBorders>
+              <w:top w:val="single" w:color="CCCCCC" w:sz="1"/>
+              <w:left w:val="single" w:color="CCCCCC" w:sz="1"/>
+              <w:bottom w:val="single" w:color="CCCCCC" w:sz="1"/>
+              <w:right w:val="single" w:color="CCCCCC" w:sz="1"/>
+            </w:tcBorders>
+            <w:shd w:fill="FFFFFF" w:val="clear"/>
+            <w:tcMar>
+              <w:top w:type="dxa" w:w="80"/>
+              <w:left w:type="dxa" w:w="120"/>
+              <w:bottom w:type="dxa" w:w="80"/>
+              <w:right w:type="dxa" w:w="120"/>
+            </w:tcMar>
+          </w:tcPr>
+          <w:p>
+            <w:r>
+              <w:rPr>
+                <w:sz w:val="21"/>
+                <w:szCs w:val="21"/>
+              </w:rPr>
+              <w:t xml:space="preserve">400</w:t>
+            </w:r>
+          </w:p>
+        </w:tc>
+        <w:tc>
+          <w:tcPr>
+            <w:tcW w:type="dxa" w:w="4960"/>
+            <w:tcBorders>
+              <w:top w:val="single" w:color="CCCCCC" w:sz="1"/>
+              <w:left w:val="single" w:color="CCCCCC" w:sz="1"/>
+              <w:bottom w:val="single" w:color="CCCCCC" w:sz="1"/>
+              <w:right w:val="single" w:color="CCCCCC" w:sz="1"/>
+            </w:tcBorders>
+            <w:shd w:fill="FFFFFF" w:val="clear"/>
+            <w:tcMar>
+              <w:top w:type="dxa" w:w="80"/>
+              <w:left w:type="dxa" w:w="120"/>
+              <w:bottom w:type="dxa" w:w="80"/>
+              <w:right w:type="dxa" w:w="120"/>
+            </w:tcMar>
+          </w:tcPr>
+          <w:p>
+            <w:pPr>
+              <w:spacing w:before="20" w:after="20"/>
+            </w:pPr>
+            <w:r>
+              <w:rPr>
+                <w:rFonts w:ascii="Arial" w:cs="Arial" w:eastAsia="Arial" w:hAnsi="Arial"/>
+                <w:color w:val="111827"/>
+                <w:sz w:val="20"/>
+                <w:szCs w:val="20"/>
+              </w:rPr>
+              <w:t xml:space="preserve">{"error":"category is required"}</w:t>
+            </w:r>
+          </w:p>
+        </w:tc>
+      </w:tr>
+      <w:tr>
+        <w:tc>
+          <w:tcPr>
+            <w:tcW w:type="dxa" w:w="2400"/>
+            <w:tcBorders>
+              <w:top w:val="single" w:color="CCCCCC" w:sz="1"/>
+              <w:left w:val="single" w:color="CCCCCC" w:sz="1"/>
+              <w:bottom w:val="single" w:color="CCCCCC" w:sz="1"/>
+              <w:right w:val="single" w:color="CCCCCC" w:sz="1"/>
+            </w:tcBorders>
+            <w:shd w:fill="F9FAFB" w:val="clear"/>
+            <w:tcMar>
+              <w:top w:type="dxa" w:w="80"/>
+              <w:left w:type="dxa" w:w="120"/>
+              <w:bottom w:type="dxa" w:w="80"/>
+              <w:right w:type="dxa" w:w="120"/>
+            </w:tcMar>
+          </w:tcPr>
+          <w:p>
+            <w:r>
+              <w:rPr>
+                <w:sz w:val="21"/>
+                <w:szCs w:val="21"/>
+              </w:rPr>
+              <w:t xml:space="preserve">POST /sync/trigger</w:t>
+            </w:r>
+          </w:p>
+        </w:tc>
+        <w:tc>
+          <w:tcPr>
+            <w:tcW w:type="dxa" w:w="2000"/>
+            <w:tcBorders>
+              <w:top w:val="single" w:color="CCCCCC" w:sz="1"/>
+              <w:left w:val="single" w:color="CCCCCC" w:sz="1"/>
+              <w:bottom w:val="single" w:color="CCCCCC" w:sz="1"/>
+              <w:right w:val="single" w:color="CCCCCC" w:sz="1"/>
+            </w:tcBorders>
+            <w:shd w:fill="F9FAFB" w:val="clear"/>
+            <w:tcMar>
+              <w:top w:type="dxa" w:w="80"/>
+              <w:left w:type="dxa" w:w="120"/>
+              <w:bottom w:type="dxa" w:w="80"/>
+              <w:right w:type="dxa" w:w="120"/>
+            </w:tcMar>
+          </w:tcPr>
+          <w:p>
+            <w:r>
+              <w:rPr>
+                <w:sz w:val="21"/>
+                <w:szCs w:val="21"/>
+              </w:rPr>
+              <w:t xml:space="preserve">202 Accepted</w:t>
+            </w:r>
+          </w:p>
+        </w:tc>
+        <w:tc>
+          <w:tcPr>
+            <w:tcW w:type="dxa" w:w="4960"/>
+            <w:tcBorders>
+              <w:top w:val="single" w:color="CCCCCC" w:sz="1"/>
+              <w:left w:val="single" w:color="CCCCCC" w:sz="1"/>
+              <w:bottom w:val="single" w:color="CCCCCC" w:sz="1"/>
+              <w:right w:val="single" w:color="CCCCCC" w:sz="1"/>
+            </w:tcBorders>
+            <w:shd w:fill="F9FAFB" w:val="clear"/>
+            <w:tcMar>
+              <w:top w:type="dxa" w:w="80"/>
+              <w:left w:type="dxa" w:w="120"/>
+              <w:bottom w:type="dxa" w:w="80"/>
+              <w:right w:type="dxa" w:w="120"/>
+            </w:tcMar>
+          </w:tcPr>
+          <w:p>
+            <w:pPr>
+              <w:spacing w:before="20" w:after="20"/>
+            </w:pPr>
+            <w:r>
+              <w:rPr>
+                <w:rFonts w:ascii="Arial" w:cs="Arial" w:eastAsia="Arial" w:hAnsi="Arial"/>
+                <w:color w:val="111827"/>
+                <w:sz w:val="20"/>
+                <w:szCs w:val="20"/>
+              </w:rPr>
+              <w:t xml:space="preserve">{"run_id":"run_1773678885920401700","status":"started","message":"sync triggered successfully"}</w:t>
+            </w:r>
+          </w:p>
+        </w:tc>
+      </w:tr>
+      <w:tr>
+        <w:tc>
+          <w:tcPr>
+            <w:tcW w:type="dxa" w:w="2400"/>
+            <w:tcBorders>
+              <w:top w:val="single" w:color="CCCCCC" w:sz="1"/>
+              <w:left w:val="single" w:color="CCCCCC" w:sz="1"/>
+              <w:bottom w:val="single" w:color="CCCCCC" w:sz="1"/>
+              <w:right w:val="single" w:color="CCCCCC" w:sz="1"/>
+            </w:tcBorders>
+            <w:shd w:fill="FFFFFF" w:val="clear"/>
+            <w:tcMar>
+              <w:top w:type="dxa" w:w="80"/>
+              <w:left w:type="dxa" w:w="120"/>
+              <w:bottom w:type="dxa" w:w="80"/>
+              <w:right w:type="dxa" w:w="120"/>
+            </w:tcMar>
+          </w:tcPr>
+          <w:p>
+            <w:r>
+              <w:rPr>
+                <w:sz w:val="21"/>
+                <w:szCs w:val="21"/>
+              </w:rPr>
+              <w:t xml:space="preserve">POST /sync/trigger (already running)</w:t>
+            </w:r>
+          </w:p>
+        </w:tc>
+        <w:tc>
+          <w:tcPr>
+            <w:tcW w:type="dxa" w:w="2000"/>
+            <w:tcBorders>
+              <w:top w:val="single" w:color="CCCCCC" w:sz="1"/>
+              <w:left w:val="single" w:color="CCCCCC" w:sz="1"/>
+              <w:bottom w:val="single" w:color="CCCCCC" w:sz="1"/>
+              <w:right w:val="single" w:color="CCCCCC" w:sz="1"/>
+            </w:tcBorders>
+            <w:shd w:fill="FFFFFF" w:val="clear"/>
+            <w:tcMar>
+              <w:top w:type="dxa" w:w="80"/>
+              <w:left w:type="dxa" w:w="120"/>
+              <w:bottom w:type="dxa" w:w="80"/>
+              <w:right w:type="dxa" w:w="120"/>
+            </w:tcMar>
+          </w:tcPr>
+          <w:p>
+            <w:r>
+              <w:rPr>
+                <w:sz w:val="21"/>
+                <w:szCs w:val="21"/>
+              </w:rPr>
+              <w:t xml:space="preserve">409 Conflict</w:t>
+            </w:r>
+          </w:p>
+        </w:tc>
+        <w:tc>
+          <w:tcPr>
+            <w:tcW w:type="dxa" w:w="4960"/>
+            <w:tcBorders>
+              <w:top w:val="single" w:color="CCCCCC" w:sz="1"/>
+              <w:left w:val="single" w:color="CCCCCC" w:sz="1"/>
+              <w:bottom w:val="single" w:color="CCCCCC" w:sz="1"/>
+              <w:right w:val="single" w:color="CCCCCC" w:sz="1"/>
+            </w:tcBorders>
+            <w:shd w:fill="FFFFFF" w:val="clear"/>
+            <w:tcMar>
+              <w:top w:type="dxa" w:w="80"/>
+              <w:left w:type="dxa" w:w="120"/>
+              <w:bottom w:type="dxa" w:w="80"/>
+              <w:right w:type="dxa" w:w="120"/>
+            </w:tcMar>
+          </w:tcPr>
+          <w:p>
+            <w:pPr>
+              <w:spacing w:before="20" w:after="20"/>
+            </w:pPr>
+            <w:r>
+              <w:rPr>
+                <w:rFonts w:ascii="Arial" w:cs="Arial" w:eastAsia="Arial" w:hAnsi="Arial"/>
+                <w:color w:val="111827"/>
+                <w:sz w:val="20"/>
+                <w:szCs w:val="20"/>
+              </w:rPr>
+              <w:t xml:space="preserve">{"error":"sync already in progress"}</w:t>
+            </w:r>
+          </w:p>
+        </w:tc>
+      </w:tr>
+      <w:tr>
+        <w:tc>
+          <w:tcPr>
+            <w:tcW w:type="dxa" w:w="2400"/>
+            <w:tcBorders>
+              <w:top w:val="single" w:color="CCCCCC" w:sz="1"/>
+              <w:left w:val="single" w:color="CCCCCC" w:sz="1"/>
+              <w:bottom w:val="single" w:color="CCCCCC" w:sz="1"/>
+              <w:right w:val="single" w:color="CCCCCC" w:sz="1"/>
+            </w:tcBorders>
+            <w:shd w:fill="F9FAFB" w:val="clear"/>
+            <w:tcMar>
+              <w:top w:type="dxa" w:w="80"/>
+              <w:left w:type="dxa" w:w="120"/>
+              <w:bottom w:type="dxa" w:w="80"/>
+              <w:right w:type="dxa" w:w="120"/>
+            </w:tcMar>
+          </w:tcPr>
+          <w:p>
+            <w:r>
+              <w:rPr>
+                <w:sz w:val="21"/>
+                <w:szCs w:val="21"/>
+              </w:rPr>
+              <w:t xml:space="preserve">GET /sync/status</w:t>
+            </w:r>
+          </w:p>
+        </w:tc>
+        <w:tc>
+          <w:tcPr>
+            <w:tcW w:type="dxa" w:w="2000"/>
+            <w:tcBorders>
+              <w:top w:val="single" w:color="CCCCCC" w:sz="1"/>
+              <w:left w:val="single" w:color="CCCCCC" w:sz="1"/>
+              <w:bottom w:val="single" w:color="CCCCCC" w:sz="1"/>
+              <w:right w:val="single" w:color="CCCCCC" w:sz="1"/>
+            </w:tcBorders>
+            <w:shd w:fill="F9FAFB" w:val="clear"/>
+            <w:tcMar>
+              <w:top w:type="dxa" w:w="80"/>
+              <w:left w:type="dxa" w:w="120"/>
+              <w:bottom w:type="dxa" w:w="80"/>
+              <w:right w:type="dxa" w:w="120"/>
+            </w:tcMar>
+          </w:tcPr>
+          <w:p>
+            <w:r>
+              <w:rPr>
+                <w:sz w:val="21"/>
+                <w:szCs w:val="21"/>
+              </w:rPr>
+              <w:t xml:space="preserve">200 OK</w:t>
+            </w:r>
+          </w:p>
+        </w:tc>
+        <w:tc>
+          <w:tcPr>
+            <w:tcW w:type="dxa" w:w="4960"/>
+            <w:tcBorders>
+              <w:top w:val="single" w:color="CCCCCC" w:sz="1"/>
+              <w:left w:val="single" w:color="CCCCCC" w:sz="1"/>
+              <w:bottom w:val="single" w:color="CCCCCC" w:sz="1"/>
+              <w:right w:val="single" w:color="CCCCCC" w:sz="1"/>
+            </w:tcBorders>
+            <w:shd w:fill="F9FAFB" w:val="clear"/>
+            <w:tcMar>
+              <w:top w:type="dxa" w:w="80"/>
+              <w:left w:type="dxa" w:w="120"/>
+              <w:bottom w:type="dxa" w:w="80"/>
+              <w:right w:type="dxa" w:w="120"/>
+            </w:tcMar>
+          </w:tcPr>
+          <w:p>
+            <w:pPr>
+              <w:spacing w:before="20" w:after="20"/>
+            </w:pPr>
+            <w:r>
+              <w:rPr>
+                <w:rFonts w:ascii="Arial" w:cs="Arial" w:eastAsia="Arial" w:hAnsi="Arial"/>
+                <w:color w:val="111827"/>
+                <w:sz w:val="20"/>
+                <w:szCs w:val="20"/>
+              </w:rPr>
+              <w:t xml:space="preserve">{"run_id":"run_1773678885920401700","status":"completed","phase":"done","started_at":"2026-03-17T00:04:46Z","completed_at":"2026-03-17T00:07:29Z"}</w:t>
+            </w:r>
+          </w:p>
+        </w:tc>
+      </w:tr>
+      <w:tr>
+        <w:tc>
+          <w:tcPr>
+            <w:tcW w:type="dxa" w:w="2400"/>
+            <w:tcBorders>
+              <w:top w:val="single" w:color="CCCCCC" w:sz="1"/>
+              <w:left w:val="single" w:color="CCCCCC" w:sz="1"/>
+              <w:bottom w:val="single" w:color="CCCCCC" w:sz="1"/>
+              <w:right w:val="single" w:color="CCCCCC" w:sz="1"/>
+            </w:tcBorders>
+            <w:shd w:fill="FFFFFF" w:val="clear"/>
+            <w:tcMar>
+              <w:top w:type="dxa" w:w="80"/>
+              <w:left w:type="dxa" w:w="120"/>
+              <w:bottom w:type="dxa" w:w="80"/>
+              <w:right w:type="dxa" w:w="120"/>
+            </w:tcMar>
+          </w:tcPr>
+          <w:p>
+            <w:r>
+              <w:rPr>
+                <w:sz w:val="21"/>
+                <w:szCs w:val="21"/>
+              </w:rPr>
+              <w:t xml:space="preserve">POST /schemes/add</w:t>
+            </w:r>
+          </w:p>
+        </w:tc>
+        <w:tc>
+          <w:tcPr>
+            <w:tcW w:type="dxa" w:w="2000"/>
+            <w:tcBorders>
+              <w:top w:val="single" w:color="CCCCCC" w:sz="1"/>
+              <w:left w:val="single" w:color="CCCCCC" w:sz="1"/>
+              <w:bottom w:val="single" w:color="CCCCCC" w:sz="1"/>
+              <w:right w:val="single" w:color="CCCCCC" w:sz="1"/>
+            </w:tcBorders>
+            <w:shd w:fill="FFFFFF" w:val="clear"/>
+            <w:tcMar>
+              <w:top w:type="dxa" w:w="80"/>
+              <w:left w:type="dxa" w:w="120"/>
+              <w:bottom w:type="dxa" w:w="80"/>
+              <w:right w:type="dxa" w:w="120"/>
+            </w:tcMar>
+          </w:tcPr>
+          <w:p>
+            <w:r>
+              <w:rPr>
+                <w:sz w:val="21"/>
+                <w:szCs w:val="21"/>
+              </w:rPr>
+              <w:t xml:space="preserve">202 Accepted</w:t>
+            </w:r>
+          </w:p>
+        </w:tc>
+        <w:tc>
+          <w:tcPr>
+            <w:tcW w:type="dxa" w:w="4960"/>
+            <w:tcBorders>
+              <w:top w:val="single" w:color="CCCCCC" w:sz="1"/>
+              <w:left w:val="single" w:color="CCCCCC" w:sz="1"/>
+              <w:bottom w:val="single" w:color="CCCCCC" w:sz="1"/>
+              <w:right w:val="single" w:color="CCCCCC" w:sz="1"/>
+            </w:tcBorders>
+            <w:shd w:fill="FFFFFF" w:val="clear"/>
+            <w:tcMar>
+              <w:top w:type="dxa" w:w="80"/>
+              <w:left w:type="dxa" w:w="120"/>
+              <w:bottom w:type="dxa" w:w="80"/>
+              <w:right w:type="dxa" w:w="120"/>
+            </w:tcMar>
+          </w:tcPr>
+          <w:p>
+            <w:pPr>
+              <w:spacing w:before="20" w:after="20"/>
+            </w:pPr>
+            <w:r>
+              <w:rPr>
+                <w:rFonts w:ascii="Arial" w:cs="Arial" w:eastAsia="Arial" w:hAnsi="Arial"/>
+                <w:color w:val="111827"/>
+                <w:sz w:val="20"/>
+                <w:szCs w:val="20"/>
+              </w:rPr>
+              <w:t xml:space="preserve">Body: {"scheme_code":"119598"}</w:t>
+            </w:r>
+          </w:p>
+          <w:p>
+            <w:pPr>
+              <w:spacing w:before="20" w:after="20"/>
+            </w:pPr>
+            <w:r>
+              <w:rPr>
+                <w:rFonts w:ascii="Arial" w:cs="Arial" w:eastAsia="Arial" w:hAnsi="Arial"/>
+                <w:color w:val="111827"/>
+                <w:sz w:val="20"/>
+                <w:szCs w:val="20"/>
+              </w:rPr>
+              <w:t xml:space="preserve">=&gt; {"message":"scheme added, fetching NAV and computing analytics in background","scheme_code":"119598","status":"processing"}</w:t>
+            </w:r>
+          </w:p>
+        </w:tc>
+      </w:tr>
+    </w:tbl>
+    <w:p>
+      <w:pPr>
         <w:spacing w:before="160" w:after="80"/>
       </w:pPr>
     </w:p>
@@ -1813,7 +3112,7 @@
           <w:sz w:val="24"/>
           <w:szCs w:val="24"/>
         </w:rPr>
-        <w:t xml:space="preserve">1.1 Algorithm</w:t>
+        <w:t xml:space="preserve">2.1 Algorithm</w:t>
       </w:r>
     </w:p>
     <w:p>
@@ -1878,7 +3177,7 @@
           <w:sz w:val="20"/>
           <w:szCs w:val="20"/>
         </w:rPr>
-        <w:t xml:space="preserve">       ratelimit:per_minute  (TTL = 3600s, tokens = 300)</w:t>
+        <w:t xml:space="preserve">       ratelimit:per_hour    (TTL = 3600s, tokens = 300)</w:t>
       </w:r>
     </w:p>
     <w:p>
@@ -1927,7 +3226,7 @@
           <w:sz w:val="20"/>
           <w:szCs w:val="20"/>
         </w:rPr>
-        <w:t xml:space="preserve">2. If any key is nil → SET key=limit EX ttl  (new window, full bucket)</w:t>
+        <w:t xml:space="preserve">2. If any key is nil -&gt; SET key=limit EX ttl  (new window, full bucket)</w:t>
       </w:r>
     </w:p>
     <w:p>
@@ -1943,7 +3242,7 @@
           <w:sz w:val="20"/>
           <w:szCs w:val="20"/>
         </w:rPr>
-        <w:t xml:space="preserve">3. If any bucket &lt;= 0 → return denied</w:t>
+        <w:t xml:space="preserve">3. If any bucket &lt;= 0 -&gt; return denied</w:t>
       </w:r>
     </w:p>
     <w:p>
@@ -1959,7 +3258,7 @@
           <w:sz w:val="20"/>
           <w:szCs w:val="20"/>
         </w:rPr>
-        <w:t xml:space="preserve">4. DECRBY all three by 1 → return allowed</w:t>
+        <w:t xml:space="preserve">4. DECRBY all three by 1 -&gt; return allowed</w:t>
       </w:r>
     </w:p>
     <w:p>
@@ -1992,7 +3291,7 @@
           <w:sz w:val="20"/>
           <w:szCs w:val="20"/>
         </w:rPr>
-        <w:t xml:space="preserve">per_second exhausted → sleep 500ms</w:t>
+        <w:t xml:space="preserve">per_second exhausted -&gt; sleep 500ms</w:t>
       </w:r>
     </w:p>
     <w:p>
@@ -2008,7 +3307,7 @@
           <w:sz w:val="20"/>
           <w:szCs w:val="20"/>
         </w:rPr>
-        <w:t xml:space="preserve">per_minute exhausted → sleep 5s</w:t>
+        <w:t xml:space="preserve">per_minute exhausted -&gt; sleep 5s</w:t>
       </w:r>
     </w:p>
     <w:p>
@@ -2024,7 +3323,7 @@
           <w:sz w:val="20"/>
           <w:szCs w:val="20"/>
         </w:rPr>
-        <w:t xml:space="preserve">per_hour exhausted   → sleep 5 minutes</w:t>
+        <w:t xml:space="preserve">per_hour exhausted   -&gt; sleep 5 minutes</w:t>
       </w:r>
     </w:p>
     <w:p>
@@ -2045,7 +3344,7 @@
           <w:sz w:val="24"/>
           <w:szCs w:val="24"/>
         </w:rPr>
-        <w:t xml:space="preserve">1.2 Coordinating Three Concurrent Limits</w:t>
+        <w:t xml:space="preserve">2.2 Why Lua Script Instead of Go Mutex</w:t>
       </w:r>
     </w:p>
     <w:p>
@@ -2057,7 +3356,7 @@
           <w:sz w:val="22"/>
           <w:szCs w:val="22"/>
         </w:rPr>
-        <w:t xml:space="preserve">All three limits are checked in a single atomic Lua script call. This means:</w:t>
+        <w:t xml:space="preserve">A Go mutex (sync.Mutex) only protects state within a single process. Our rate limiter state lives in Redis so it survives process restarts and can be shared across multiple instances. A Lua script running on Redis is the correct tool because:</w:t>
       </w:r>
     </w:p>
     <w:p>
@@ -2074,7 +3373,7 @@
           <w:sz w:val="22"/>
           <w:szCs w:val="22"/>
         </w:rPr>
-        <w:t xml:space="preserve">One Redis round trip checks and decrements per_second + per_minute + per_hour simultaneously</w:t>
+        <w:t xml:space="preserve">Atomicity: Redis executes Lua scripts atomically — no other command runs between GET and DECRBY. A Go mutex cannot prevent concurrent access from a different process or goroutine after a restart.</w:t>
       </w:r>
     </w:p>
     <w:p>
@@ -2091,7 +3390,7 @@
           <w:sz w:val="22"/>
           <w:szCs w:val="22"/>
         </w:rPr>
-        <w:t xml:space="preserve">A request is only allowed if ALL THREE buckets have tokens remaining</w:t>
+        <w:t xml:space="preserve">Persistence: Redis state (token counts, TTLs) survives Go process crashes and restarts. A Go mutex lives in memory — on restart all state is lost and limits reset, potentially allowing quota exhaustion.</w:t>
       </w:r>
     </w:p>
     <w:p>
@@ -2108,7 +3407,7 @@
           <w:sz w:val="22"/>
           <w:szCs w:val="22"/>
         </w:rPr>
-        <w:t xml:space="preserve">No two goroutines can read the same non-zero count and both proceed — Lua script execution is atomic on Redis</w:t>
+        <w:t xml:space="preserve">Single round trip: Checking all three buckets and decrementing them happens in one network call. Using a mutex with three separate Redis GET/SET pairs would require three round trips and would not be atomic between them.</w:t>
       </w:r>
     </w:p>
     <w:p>
@@ -2125,7 +3424,19 @@
           <w:sz w:val="22"/>
           <w:szCs w:val="22"/>
         </w:rPr>
-        <w:t xml:space="preserve">A request allowed by per_second but blocked by per_minute is correctly denied and waited</w:t>
+        <w:t xml:space="preserve">No TOCTOU race: Without Lua, two goroutines could both GET remaining=1, both decide to proceed, and both DECR — double-spending the last token. Lua prevents this entirely.</w:t>
+      </w:r>
+    </w:p>
+    <w:p>
+      <w:pPr>
+        <w:spacing w:before="60" w:after="60"/>
+      </w:pPr>
+      <w:r>
+        <w:rPr>
+          <w:sz w:val="22"/>
+          <w:szCs w:val="22"/>
+        </w:rPr>
+        <w:t xml:space="preserve">In short: Go mutex = in-process only, lost on restart. Lua script = cross-process, persistent, atomic in one round trip.</w:t>
       </w:r>
     </w:p>
     <w:p>
@@ -2146,7 +3457,40 @@
           <w:sz w:val="24"/>
           <w:szCs w:val="24"/>
         </w:rPr>
-        <w:t xml:space="preserve">1.3 Proof of Correctness — Test Results</w:t>
+        <w:t xml:space="preserve">2.3 Coordinating Three Concurrent Limits</w:t>
+      </w:r>
+    </w:p>
+    <w:p>
+      <w:pPr>
+        <w:spacing w:before="60" w:after="60"/>
+      </w:pPr>
+      <w:r>
+        <w:rPr>
+          <w:sz w:val="22"/>
+          <w:szCs w:val="22"/>
+        </w:rPr>
+        <w:t xml:space="preserve">All three limits are checked in a single atomic Lua script call. A request is allowed only if ALL THREE buckets have tokens remaining. One Redis round trip checks and decrements per_second + per_minute + per_hour simultaneously.</w:t>
+      </w:r>
+    </w:p>
+    <w:p>
+      <w:pPr>
+        <w:spacing w:before="120" w:after="80"/>
+      </w:pPr>
+    </w:p>
+    <w:p>
+      <w:pPr>
+        <w:pStyle w:val="Heading2"/>
+        <w:spacing w:before="200" w:after="80"/>
+      </w:pPr>
+      <w:r>
+        <w:rPr>
+          <w:b/>
+          <w:bCs/>
+          <w:color w:val="2563EB"/>
+          <w:sz w:val="24"/>
+          <w:szCs w:val="24"/>
+        </w:rPr>
+        <w:t xml:space="preserve">2.4 Proof of Correctness — Test Results</w:t>
       </w:r>
     </w:p>
     <w:tbl>
@@ -2334,7 +3678,7 @@
                 <w:sz w:val="21"/>
                 <w:szCs w:val="21"/>
               </w:rPr>
-              <w:t xml:space="preserve">50 requests consumed, remaining=0 — per_minute bucket counts correctly</w:t>
+              <w:t xml:space="preserve">50 requests consumed, remaining=0 — per_minute counts correctly</w:t>
             </w:r>
           </w:p>
         </w:tc>
@@ -2390,7 +3734,7 @@
                 <w:sz w:val="21"/>
                 <w:szCs w:val="21"/>
               </w:rPr>
-              <w:t xml:space="preserve">10 goroutines all acquired tokens — atomic Lua prevents double-spend</w:t>
+              <w:t xml:space="preserve">10 goroutines all acquired tokens — Lua atomicity prevents double-spend</w:t>
             </w:r>
           </w:p>
         </w:tc>
@@ -2502,7 +3846,7 @@
                 <w:sz w:val="21"/>
                 <w:szCs w:val="21"/>
               </w:rPr>
-              <w:t xml:space="preserve">TTL=57s after 3s wait — window not reset on DECRBY, fixed window confirmed</w:t>
+              <w:t xml:space="preserve">TTL=57s after 3s wait — fixed window confirmed, not sliding</w:t>
             </w:r>
           </w:p>
         </w:tc>
@@ -2654,7 +3998,7 @@
           <w:sz w:val="24"/>
           <w:szCs w:val="24"/>
         </w:rPr>
-        <w:t xml:space="preserve">2.1 Strategy</w:t>
+        <w:t xml:space="preserve">3.1 Strategy</w:t>
       </w:r>
     </w:p>
     <w:p>
@@ -2915,7 +4259,7 @@
                 <w:sz w:val="21"/>
                 <w:szCs w:val="21"/>
               </w:rPr>
-              <w:t xml:space="preserve">Sequential fetch with rate limiter — max 2 concurrent</w:t>
+              <w:t xml:space="preserve">Sequential fetch with rate limiter — max 2 per second</w:t>
             </w:r>
           </w:p>
         </w:tc>
@@ -2939,7 +4283,7 @@
           <w:sz w:val="24"/>
           <w:szCs w:val="24"/>
         </w:rPr>
-        <w:t xml:space="preserve">2.2 Incremental Sync</w:t>
+        <w:t xml:space="preserve">3.2 Incremental Sync</w:t>
       </w:r>
     </w:p>
     <w:p>
@@ -2972,7 +4316,7 @@
           <w:sz w:val="24"/>
           <w:szCs w:val="24"/>
         </w:rPr>
-        <w:t xml:space="preserve">2.3 Resumability After Crash</w:t>
+        <w:t xml:space="preserve">3.3 Resumability After Crash</w:t>
       </w:r>
     </w:p>
     <w:p>
@@ -3094,7 +4438,7 @@
           <w:sz w:val="24"/>
           <w:szCs w:val="24"/>
         </w:rPr>
-        <w:t xml:space="preserve">3.1 Schema</w:t>
+        <w:t xml:space="preserve">4.1 Schema</w:t>
       </w:r>
     </w:p>
     <w:tbl>
@@ -3284,7 +4628,7 @@
                 <w:sz w:val="21"/>
                 <w:szCs w:val="21"/>
               </w:rPr>
-              <w:t xml:space="preserve">current_nav and nav_date columns store latest values — avoids hypertable scan on every GET /funds/:code</w:t>
+              <w:t xml:space="preserve">current_nav and nav_date stored directly — single PK lookup on GET /funds/:code, no hypertable scan needed</w:t>
             </w:r>
           </w:p>
         </w:tc>
@@ -3640,7 +4984,7 @@
           <w:sz w:val="24"/>
           <w:szCs w:val="24"/>
         </w:rPr>
-        <w:t xml:space="preserve">3.2 Why TimescaleDB</w:t>
+        <w:t xml:space="preserve">4.2 Why TimescaleDB</w:t>
       </w:r>
     </w:p>
     <w:p>
@@ -3709,39 +5053,6 @@
           <w:szCs w:val="22"/>
         </w:rPr>
         <w:t xml:space="preserve">Primary key (scheme_code, nav_date) prevents duplicate NAV entries on re-sync</w:t>
-      </w:r>
-    </w:p>
-    <w:p>
-      <w:pPr>
-        <w:spacing w:before="120" w:after="80"/>
-      </w:pPr>
-    </w:p>
-    <w:p>
-      <w:pPr>
-        <w:pStyle w:val="Heading2"/>
-        <w:spacing w:before="200" w:after="80"/>
-      </w:pPr>
-      <w:r>
-        <w:rPr>
-          <w:b/>
-          <w:bCs/>
-          <w:color w:val="2563EB"/>
-          <w:sz w:val="24"/>
-          <w:szCs w:val="24"/>
-        </w:rPr>
-        <w:t xml:space="preserve">3.3 Why current_nav in funds table</w:t>
-      </w:r>
-    </w:p>
-    <w:p>
-      <w:pPr>
-        <w:spacing w:before="60" w:after="60"/>
-      </w:pPr>
-      <w:r>
-        <w:rPr>
-          <w:sz w:val="22"/>
-          <w:szCs w:val="22"/>
-        </w:rPr>
-        <w:t xml:space="preserve">Originally GET /funds/:code queried nav_data with ORDER BY nav_date DESC LIMIT 1. TimescaleDB scanned multiple time-based chunks to find the latest row, taking 263ms on first call. Storing current_nav and nav_date directly in the funds table (updated on every sync) reduces this to a single primary-key lookup — consistently ~5ms.</w:t>
       </w:r>
     </w:p>
     <w:p>
@@ -3765,314 +5076,6 @@
         <w:t xml:space="preserve">5. Pre-computation vs On-demand Trade-offs</w:t>
       </w:r>
     </w:p>
-    <w:tbl>
-      <w:tblPr>
-        <w:tblW w:type="dxa" w:w="9360"/>
-        <w:tblBorders>
-          <w:top w:val="single" w:color="auto" w:sz="4"/>
-          <w:left w:val="single" w:color="auto" w:sz="4"/>
-          <w:bottom w:val="single" w:color="auto" w:sz="4"/>
-          <w:right w:val="single" w:color="auto" w:sz="4"/>
-          <w:insideH w:val="single" w:color="auto" w:sz="4"/>
-          <w:insideV w:val="single" w:color="auto" w:sz="4"/>
-        </w:tblBorders>
-      </w:tblPr>
-      <w:tblGrid>
-        <w:gridCol w:w="3400"/>
-        <w:gridCol w:w="5960"/>
-      </w:tblGrid>
-      <w:tr>
-        <w:tc>
-          <w:tcPr>
-            <w:tcW w:type="dxa" w:w="3400"/>
-            <w:tcBorders>
-              <w:top w:val="single" w:color="1E3A5F" w:sz="1"/>
-              <w:left w:val="single" w:color="1E3A5F" w:sz="1"/>
-              <w:bottom w:val="single" w:color="1E3A5F" w:sz="1"/>
-              <w:right w:val="single" w:color="1E3A5F" w:sz="1"/>
-            </w:tcBorders>
-            <w:shd w:fill="1E3A5F" w:val="clear"/>
-            <w:tcMar>
-              <w:top w:type="dxa" w:w="80"/>
-              <w:left w:type="dxa" w:w="120"/>
-              <w:bottom w:type="dxa" w:w="80"/>
-              <w:right w:type="dxa" w:w="120"/>
-            </w:tcMar>
-          </w:tcPr>
-          <w:p>
-            <w:r>
-              <w:rPr>
-                <w:b/>
-                <w:bCs/>
-                <w:color w:val="FFFFFF"/>
-                <w:sz w:val="21"/>
-                <w:szCs w:val="21"/>
-              </w:rPr>
-              <w:t xml:space="preserve">Decision</w:t>
-            </w:r>
-          </w:p>
-        </w:tc>
-        <w:tc>
-          <w:tcPr>
-            <w:tcW w:type="dxa" w:w="5960"/>
-            <w:tcBorders>
-              <w:top w:val="single" w:color="1E3A5F" w:sz="1"/>
-              <w:left w:val="single" w:color="1E3A5F" w:sz="1"/>
-              <w:bottom w:val="single" w:color="1E3A5F" w:sz="1"/>
-              <w:right w:val="single" w:color="1E3A5F" w:sz="1"/>
-            </w:tcBorders>
-            <w:shd w:fill="1E3A5F" w:val="clear"/>
-            <w:tcMar>
-              <w:top w:type="dxa" w:w="80"/>
-              <w:left w:type="dxa" w:w="120"/>
-              <w:bottom w:type="dxa" w:w="80"/>
-              <w:right w:type="dxa" w:w="120"/>
-            </w:tcMar>
-          </w:tcPr>
-          <w:p>
-            <w:r>
-              <w:rPr>
-                <w:b/>
-                <w:bCs/>
-                <w:color w:val="FFFFFF"/>
-                <w:sz w:val="21"/>
-                <w:szCs w:val="21"/>
-              </w:rPr>
-              <w:t xml:space="preserve">Reasoning</w:t>
-            </w:r>
-          </w:p>
-        </w:tc>
-      </w:tr>
-      <w:tr>
-        <w:tc>
-          <w:tcPr>
-            <w:tcW w:type="dxa" w:w="3400"/>
-            <w:tcBorders>
-              <w:top w:val="single" w:color="CCCCCC" w:sz="1"/>
-              <w:left w:val="single" w:color="CCCCCC" w:sz="1"/>
-              <w:bottom w:val="single" w:color="CCCCCC" w:sz="1"/>
-              <w:right w:val="single" w:color="CCCCCC" w:sz="1"/>
-            </w:tcBorders>
-            <w:shd w:fill="F9FAFB" w:val="clear"/>
-            <w:tcMar>
-              <w:top w:type="dxa" w:w="80"/>
-              <w:left w:type="dxa" w:w="120"/>
-              <w:bottom w:type="dxa" w:w="80"/>
-              <w:right w:type="dxa" w:w="120"/>
-            </w:tcMar>
-          </w:tcPr>
-          <w:p>
-            <w:r>
-              <w:rPr>
-                <w:sz w:val="21"/>
-                <w:szCs w:val="21"/>
-              </w:rPr>
-              <w:t xml:space="preserve">Analytics pre-computed at sync time</w:t>
-            </w:r>
-          </w:p>
-        </w:tc>
-        <w:tc>
-          <w:tcPr>
-            <w:tcW w:type="dxa" w:w="5960"/>
-            <w:tcBorders>
-              <w:top w:val="single" w:color="CCCCCC" w:sz="1"/>
-              <w:left w:val="single" w:color="CCCCCC" w:sz="1"/>
-              <w:bottom w:val="single" w:color="CCCCCC" w:sz="1"/>
-              <w:right w:val="single" w:color="CCCCCC" w:sz="1"/>
-            </w:tcBorders>
-            <w:shd w:fill="F9FAFB" w:val="clear"/>
-            <w:tcMar>
-              <w:top w:type="dxa" w:w="80"/>
-              <w:left w:type="dxa" w:w="120"/>
-              <w:bottom w:type="dxa" w:w="80"/>
-              <w:right w:type="dxa" w:w="120"/>
-            </w:tcMar>
-          </w:tcPr>
-          <w:p>
-            <w:r>
-              <w:rPr>
-                <w:sz w:val="21"/>
-                <w:szCs w:val="21"/>
-              </w:rPr>
-              <w:t xml:space="preserve">Rolling returns/CAGR/drawdown require scanning all NAV points. No incremental formula exists for median or percentiles — full recompute is unavoidable. Pre-computing once at sync time and caching in Redis/DB means all analytics queries are served in ~5ms regardless of data size.</w:t>
-            </w:r>
-          </w:p>
-        </w:tc>
-      </w:tr>
-      <w:tr>
-        <w:tc>
-          <w:tcPr>
-            <w:tcW w:type="dxa" w:w="3400"/>
-            <w:tcBorders>
-              <w:top w:val="single" w:color="CCCCCC" w:sz="1"/>
-              <w:left w:val="single" w:color="CCCCCC" w:sz="1"/>
-              <w:bottom w:val="single" w:color="CCCCCC" w:sz="1"/>
-              <w:right w:val="single" w:color="CCCCCC" w:sz="1"/>
-            </w:tcBorders>
-            <w:shd w:fill="FFFFFF" w:val="clear"/>
-            <w:tcMar>
-              <w:top w:type="dxa" w:w="80"/>
-              <w:left w:type="dxa" w:w="120"/>
-              <w:bottom w:type="dxa" w:w="80"/>
-              <w:right w:type="dxa" w:w="120"/>
-            </w:tcMar>
-          </w:tcPr>
-          <w:p>
-            <w:r>
-              <w:rPr>
-                <w:sz w:val="21"/>
-                <w:szCs w:val="21"/>
-              </w:rPr>
-              <w:t xml:space="preserve">Rankings pre-computed at sync time</w:t>
-            </w:r>
-          </w:p>
-        </w:tc>
-        <w:tc>
-          <w:tcPr>
-            <w:tcW w:type="dxa" w:w="5960"/>
-            <w:tcBorders>
-              <w:top w:val="single" w:color="CCCCCC" w:sz="1"/>
-              <w:left w:val="single" w:color="CCCCCC" w:sz="1"/>
-              <w:bottom w:val="single" w:color="CCCCCC" w:sz="1"/>
-              <w:right w:val="single" w:color="CCCCCC" w:sz="1"/>
-            </w:tcBorders>
-            <w:shd w:fill="FFFFFF" w:val="clear"/>
-            <w:tcMar>
-              <w:top w:type="dxa" w:w="80"/>
-              <w:left w:type="dxa" w:w="120"/>
-              <w:bottom w:type="dxa" w:w="80"/>
-              <w:right w:type="dxa" w:w="120"/>
-            </w:tcMar>
-          </w:tcPr>
-          <w:p>
-            <w:r>
-              <w:rPr>
-                <w:sz w:val="21"/>
-                <w:szCs w:val="21"/>
-              </w:rPr>
-              <w:t xml:space="preserve">Rankings are derived from analytics — sorting 5 funds is trivial but doing it on every request wastes a DB round trip. Pre-computing all 16 combinations (2 categories × 4 windows × 2 sort_by) after analytics are done stores them in Redis. GET /funds/rank serves in ~2ms from Redis.</w:t>
-            </w:r>
-          </w:p>
-        </w:tc>
-      </w:tr>
-      <w:tr>
-        <w:tc>
-          <w:tcPr>
-            <w:tcW w:type="dxa" w:w="3400"/>
-            <w:tcBorders>
-              <w:top w:val="single" w:color="CCCCCC" w:sz="1"/>
-              <w:left w:val="single" w:color="CCCCCC" w:sz="1"/>
-              <w:bottom w:val="single" w:color="CCCCCC" w:sz="1"/>
-              <w:right w:val="single" w:color="CCCCCC" w:sz="1"/>
-            </w:tcBorders>
-            <w:shd w:fill="F9FAFB" w:val="clear"/>
-            <w:tcMar>
-              <w:top w:type="dxa" w:w="80"/>
-              <w:left w:type="dxa" w:w="120"/>
-              <w:bottom w:type="dxa" w:w="80"/>
-              <w:right w:type="dxa" w:w="120"/>
-            </w:tcMar>
-          </w:tcPr>
-          <w:p>
-            <w:r>
-              <w:rPr>
-                <w:sz w:val="21"/>
-                <w:szCs w:val="21"/>
-              </w:rPr>
-              <w:t xml:space="preserve">current_nav in funds table (not computed on demand)</w:t>
-            </w:r>
-          </w:p>
-        </w:tc>
-        <w:tc>
-          <w:tcPr>
-            <w:tcW w:type="dxa" w:w="5960"/>
-            <w:tcBorders>
-              <w:top w:val="single" w:color="CCCCCC" w:sz="1"/>
-              <w:left w:val="single" w:color="CCCCCC" w:sz="1"/>
-              <w:bottom w:val="single" w:color="CCCCCC" w:sz="1"/>
-              <w:right w:val="single" w:color="CCCCCC" w:sz="1"/>
-            </w:tcBorders>
-            <w:shd w:fill="F9FAFB" w:val="clear"/>
-            <w:tcMar>
-              <w:top w:type="dxa" w:w="80"/>
-              <w:left w:type="dxa" w:w="120"/>
-              <w:bottom w:type="dxa" w:w="80"/>
-              <w:right w:type="dxa" w:w="120"/>
-            </w:tcMar>
-          </w:tcPr>
-          <w:p>
-            <w:r>
-              <w:rPr>
-                <w:sz w:val="21"/>
-                <w:szCs w:val="21"/>
-              </w:rPr>
-              <w:t xml:space="preserve">See section 3.3. Single PK lookup vs multi-chunk hypertable scan.</w:t>
-            </w:r>
-          </w:p>
-        </w:tc>
-      </w:tr>
-      <w:tr>
-        <w:tc>
-          <w:tcPr>
-            <w:tcW w:type="dxa" w:w="3400"/>
-            <w:tcBorders>
-              <w:top w:val="single" w:color="CCCCCC" w:sz="1"/>
-              <w:left w:val="single" w:color="CCCCCC" w:sz="1"/>
-              <w:bottom w:val="single" w:color="CCCCCC" w:sz="1"/>
-              <w:right w:val="single" w:color="CCCCCC" w:sz="1"/>
-            </w:tcBorders>
-            <w:shd w:fill="FFFFFF" w:val="clear"/>
-            <w:tcMar>
-              <w:top w:type="dxa" w:w="80"/>
-              <w:left w:type="dxa" w:w="120"/>
-              <w:bottom w:type="dxa" w:w="80"/>
-              <w:right w:type="dxa" w:w="120"/>
-            </w:tcMar>
-          </w:tcPr>
-          <w:p>
-            <w:r>
-              <w:rPr>
-                <w:sz w:val="21"/>
-                <w:szCs w:val="21"/>
-              </w:rPr>
-              <w:t xml:space="preserve">GET /funds/:code — no cache</w:t>
-            </w:r>
-          </w:p>
-        </w:tc>
-        <w:tc>
-          <w:tcPr>
-            <w:tcW w:type="dxa" w:w="5960"/>
-            <w:tcBorders>
-              <w:top w:val="single" w:color="CCCCCC" w:sz="1"/>
-              <w:left w:val="single" w:color="CCCCCC" w:sz="1"/>
-              <w:bottom w:val="single" w:color="CCCCCC" w:sz="1"/>
-              <w:right w:val="single" w:color="CCCCCC" w:sz="1"/>
-            </w:tcBorders>
-            <w:shd w:fill="FFFFFF" w:val="clear"/>
-            <w:tcMar>
-              <w:top w:type="dxa" w:w="80"/>
-              <w:left w:type="dxa" w:w="120"/>
-              <w:bottom w:type="dxa" w:w="80"/>
-              <w:right w:type="dxa" w:w="120"/>
-            </w:tcMar>
-          </w:tcPr>
-          <w:p>
-            <w:r>
-              <w:rPr>
-                <w:sz w:val="21"/>
-                <w:szCs w:val="21"/>
-              </w:rPr>
-              <w:t xml:space="preserve">Single PK lookup on funds table is already ~5ms. Adding Redis cache adds complexity with no meaningful gain.</w:t>
-            </w:r>
-          </w:p>
-        </w:tc>
-      </w:tr>
-    </w:tbl>
-    <w:p>
-      <w:pPr>
-        <w:spacing w:before="120" w:after="80"/>
-      </w:pPr>
-    </w:p>
     <w:p>
       <w:pPr>
         <w:pStyle w:val="Heading2"/>
@@ -4086,7 +5089,156 @@
           <w:sz w:val="24"/>
           <w:szCs w:val="24"/>
         </w:rPr>
-        <w:t xml:space="preserve">4.1 Performance Results</w:t>
+        <w:t xml:space="preserve">5.1 What is Pre-computed and Why</w:t>
+      </w:r>
+    </w:p>
+    <w:p>
+      <w:pPr>
+        <w:spacing w:before="60" w:after="60"/>
+      </w:pPr>
+      <w:r>
+        <w:rPr>
+          <w:sz w:val="22"/>
+          <w:szCs w:val="22"/>
+        </w:rPr>
+        <w:t xml:space="preserve">The core question is: should we compute analytics at query time (on-demand) or at sync time (pre-computed)? The answer depends on three factors: computation cost, query frequency, and data freshness requirements.</w:t>
+      </w:r>
+    </w:p>
+    <w:p>
+      <w:pPr>
+        <w:spacing w:before="80" w:after="40"/>
+      </w:pPr>
+    </w:p>
+    <w:p>
+      <w:pPr>
+        <w:spacing w:before="60" w:after="60"/>
+      </w:pPr>
+      <w:r>
+        <w:rPr>
+          <w:sz w:val="22"/>
+          <w:szCs w:val="22"/>
+        </w:rPr>
+        <w:t xml:space="preserve">Analytics (rolling returns, CAGR, drawdown) — Pre-computed at sync time</w:t>
+      </w:r>
+    </w:p>
+    <w:p>
+      <w:pPr>
+        <w:spacing w:before="60" w:after="60"/>
+      </w:pPr>
+      <w:r>
+        <w:rPr>
+          <w:sz w:val="22"/>
+          <w:szCs w:val="22"/>
+        </w:rPr>
+        <w:t xml:space="preserve">Computing rolling returns requires scanning all 3000+ NAV points for every fund for every window. For a 3Y window on ICICI Prudential Mid Cap, that means iterating 2532 rolling periods, computing return for each, sorting the full array, then extracting min/max/median/p25/p75. This takes ~200ms per fund per window in Go. There is no incremental formula — adding one new NAV point does not let you update the median without re-sorting. So on-demand computation for 5 funds across 4 windows would take 5 x 4 x 200ms = 4 seconds per request. Pre-computing once at sync time and storing in DB + Redis means every analytics query is served in ~5ms from Redis regardless of data size.</w:t>
+      </w:r>
+    </w:p>
+    <w:p>
+      <w:pPr>
+        <w:spacing w:before="80" w:after="40"/>
+      </w:pPr>
+    </w:p>
+    <w:p>
+      <w:pPr>
+        <w:spacing w:before="60" w:after="60"/>
+      </w:pPr>
+      <w:r>
+        <w:rPr>
+          <w:sz w:val="22"/>
+          <w:szCs w:val="22"/>
+        </w:rPr>
+        <w:t xml:space="preserve">Rankings — Pre-computed at sync time</w:t>
+      </w:r>
+    </w:p>
+    <w:p>
+      <w:pPr>
+        <w:spacing w:before="60" w:after="60"/>
+      </w:pPr>
+      <w:r>
+        <w:rPr>
+          <w:sz w:val="22"/>
+          <w:szCs w:val="22"/>
+        </w:rPr>
+        <w:t xml:space="preserve">Rankings are a sorted view of analytics results. The ranking for (Mid Cap, 3Y, median_return) requires fetching analytics for all 5 Mid Cap funds, sorting by median_return, assigning ranks. If done on-demand this is 5 DB reads + sort per request. Instead we pre-compute all 16 combinations (2 categories x 4 windows x 2 sort_by options) immediately after analytics are done, store the full ranked list as JSON in Redis. Every GET /funds/rank request is a single Redis GET — served in ~2ms with zero computation.</w:t>
+      </w:r>
+    </w:p>
+    <w:p>
+      <w:pPr>
+        <w:spacing w:before="80" w:after="40"/>
+      </w:pPr>
+    </w:p>
+    <w:p>
+      <w:pPr>
+        <w:spacing w:before="60" w:after="60"/>
+      </w:pPr>
+      <w:r>
+        <w:rPr>
+          <w:sz w:val="22"/>
+          <w:szCs w:val="22"/>
+        </w:rPr>
+        <w:t xml:space="preserve">current_nav in funds table — Pre-stored, not queried from nav_data</w:t>
+      </w:r>
+    </w:p>
+    <w:p>
+      <w:pPr>
+        <w:spacing w:before="60" w:after="60"/>
+      </w:pPr>
+      <w:r>
+        <w:rPr>
+          <w:sz w:val="22"/>
+          <w:szCs w:val="22"/>
+        </w:rPr>
+        <w:t xml:space="preserve">Originally GET /funds/:code queried nav_data with ORDER BY nav_date DESC LIMIT 1. TimescaleDB scanned multiple time-based partition chunks to find the latest row for a given scheme_code, taking 263ms on first call. We store current_nav and nav_date directly in the funds table (updated on every sync). GET /funds/:code is now a single primary-key lookup — consistently ~5ms.</w:t>
+      </w:r>
+    </w:p>
+    <w:p>
+      <w:pPr>
+        <w:spacing w:before="80" w:after="40"/>
+      </w:pPr>
+    </w:p>
+    <w:p>
+      <w:pPr>
+        <w:spacing w:before="60" w:after="60"/>
+      </w:pPr>
+      <w:r>
+        <w:rPr>
+          <w:sz w:val="22"/>
+          <w:szCs w:val="22"/>
+        </w:rPr>
+        <w:t xml:space="preserve">GET /funds/:code — No Redis cache</w:t>
+      </w:r>
+    </w:p>
+    <w:p>
+      <w:pPr>
+        <w:spacing w:before="60" w:after="60"/>
+      </w:pPr>
+      <w:r>
+        <w:rPr>
+          <w:sz w:val="22"/>
+          <w:szCs w:val="22"/>
+        </w:rPr>
+        <w:t xml:space="preserve">Single primary-key lookup on the funds table is already ~5ms. Caching this in Redis would add ~1ms round trip to Redis while only saving ~4ms. The added complexity of cache invalidation on sync is not worth the marginal gain. This is an example of where on-demand is the right choice.</w:t>
+      </w:r>
+    </w:p>
+    <w:p>
+      <w:pPr>
+        <w:spacing w:before="120" w:after="80"/>
+      </w:pPr>
+    </w:p>
+    <w:p>
+      <w:pPr>
+        <w:pStyle w:val="Heading2"/>
+        <w:spacing w:before="200" w:after="80"/>
+      </w:pPr>
+      <w:r>
+        <w:rPr>
+          <w:b/>
+          <w:bCs/>
+          <w:color w:val="2563EB"/>
+          <w:sz w:val="24"/>
+          <w:szCs w:val="24"/>
+        </w:rPr>
+        <w:t xml:space="preserve">5.2 Performance Results</w:t>
       </w:r>
     </w:p>
     <w:tbl>
@@ -4191,7 +5343,7 @@
                 <w:sz w:val="21"/>
                 <w:szCs w:val="21"/>
               </w:rPr>
-              <w:t xml:space="preserve">GET /funds/rank?category=...&amp;window=3Y&amp;sort_by=median_return</w:t>
+              <w:t xml:space="preserve">GET /funds/rank?...&amp;sort_by=median_return</w:t>
             </w:r>
           </w:p>
         </w:tc>
@@ -4247,7 +5399,7 @@
                 <w:sz w:val="21"/>
                 <w:szCs w:val="21"/>
               </w:rPr>
-              <w:t xml:space="preserve">GET /funds/rank?category=...&amp;window=3Y&amp;sort_by=max_drawdown</w:t>
+              <w:t xml:space="preserve">GET /funds/rank?...&amp;sort_by=max_drawdown</w:t>
             </w:r>
           </w:p>
         </w:tc>
@@ -4442,7 +5594,7 @@
                 <w:sz w:val="21"/>
                 <w:szCs w:val="21"/>
               </w:rPr>
-              <w:t xml:space="preserve">5ms (TimescaleDB funds table PK lookup)</w:t>
+              <w:t xml:space="preserve">5ms (funds table PK lookup)</w:t>
             </w:r>
           </w:p>
         </w:tc>
@@ -4590,7 +5742,7 @@
           <w:sz w:val="22"/>
           <w:szCs w:val="22"/>
         </w:rPr>
-        <w:t xml:space="preserve">For each window (1Y/3Y/5Y/10Y), analytics.Compute() checks whether at least one valid rolling period exists within the 30-day tolerance window. If not, it returns an error and the pipeline skips writing analytics_results for that window.</w:t>
+        <w:t xml:space="preserve">For each window (1Y/3Y/5Y/10Y), analytics.Compute() checks whether at least one valid rolling period exists. If not, it returns an error and the pipeline skips writing analytics_results for that window — silently, at DEBUG log level. This does not affect POST /sync/trigger which always returns 202 Accepted immediately with a run_id. The sync runs in a background goroutine.</w:t>
       </w:r>
     </w:p>
     <w:p>
@@ -4611,13 +5763,13 @@
         </w:tblBorders>
       </w:tblPr>
       <w:tblGrid>
-        <w:gridCol w:w="3600"/>
-        <w:gridCol w:w="5760"/>
+        <w:gridCol w:w="3200"/>
+        <w:gridCol w:w="6160"/>
       </w:tblGrid>
       <w:tr>
         <w:tc>
           <w:tcPr>
-            <w:tcW w:type="dxa" w:w="3600"/>
+            <w:tcW w:type="dxa" w:w="3200"/>
             <w:tcBorders>
               <w:top w:val="single" w:color="1E3A5F" w:sz="1"/>
               <w:left w:val="single" w:color="1E3A5F" w:sz="1"/>
@@ -4647,7 +5799,7 @@
         </w:tc>
         <w:tc>
           <w:tcPr>
-            <w:tcW w:type="dxa" w:w="5760"/>
+            <w:tcW w:type="dxa" w:w="6160"/>
             <w:tcBorders>
               <w:top w:val="single" w:color="1E3A5F" w:sz="1"/>
               <w:left w:val="single" w:color="1E3A5F" w:sz="1"/>
@@ -4679,7 +5831,7 @@
       <w:tr>
         <w:tc>
           <w:tcPr>
-            <w:tcW w:type="dxa" w:w="3600"/>
+            <w:tcW w:type="dxa" w:w="3200"/>
             <w:tcBorders>
               <w:top w:val="single" w:color="CCCCCC" w:sz="1"/>
               <w:left w:val="single" w:color="CCCCCC" w:sz="1"/>
@@ -4706,28 +5858,28 @@
         </w:tc>
         <w:tc>
           <w:tcPr>
-            <w:tcW w:type="dxa" w:w="5760"/>
-            <w:tcBorders>
-              <w:top w:val="single" w:color="CCCCCC" w:sz="1"/>
-              <w:left w:val="single" w:color="CCCCCC" w:sz="1"/>
-              <w:bottom w:val="single" w:color="CCCCCC" w:sz="1"/>
-              <w:right w:val="single" w:color="CCCCCC" w:sz="1"/>
-            </w:tcBorders>
-            <w:shd w:fill="F9FAFB" w:val="clear"/>
-            <w:tcMar>
-              <w:top w:type="dxa" w:w="80"/>
-              <w:left w:type="dxa" w:w="120"/>
-              <w:bottom w:type="dxa" w:w="80"/>
-              <w:right w:type="dxa" w:w="120"/>
-            </w:tcMar>
-          </w:tcPr>
-          <w:p>
-            <w:r>
-              <w:rPr>
-                <w:sz w:val="21"/>
-                <w:szCs w:val="21"/>
-              </w:rPr>
-              <w:t xml:space="preserve">No rolling periods found. Error logged at DEBUG. No analytics_results row written. API returns 404 with message to run /sync/trigger.</w:t>
+            <w:tcW w:type="dxa" w:w="6160"/>
+            <w:tcBorders>
+              <w:top w:val="single" w:color="CCCCCC" w:sz="1"/>
+              <w:left w:val="single" w:color="CCCCCC" w:sz="1"/>
+              <w:bottom w:val="single" w:color="CCCCCC" w:sz="1"/>
+              <w:right w:val="single" w:color="CCCCCC" w:sz="1"/>
+            </w:tcBorders>
+            <w:shd w:fill="F9FAFB" w:val="clear"/>
+            <w:tcMar>
+              <w:top w:type="dxa" w:w="80"/>
+              <w:left w:type="dxa" w:w="120"/>
+              <w:bottom w:type="dxa" w:w="80"/>
+              <w:right w:type="dxa" w:w="120"/>
+            </w:tcMar>
+          </w:tcPr>
+          <w:p>
+            <w:r>
+              <w:rPr>
+                <w:sz w:val="21"/>
+                <w:szCs w:val="21"/>
+              </w:rPr>
+              <w:t xml:space="preserve">POST /sync/trigger =&gt; 202 Accepted immediately with run_id. In background: no rolling periods found, DEBUG log, no analytics_results row written. GET /funds/:code/analytics?window=1Y =&gt; 404 with message to run /sync/trigger.</w:t>
             </w:r>
           </w:p>
         </w:tc>
@@ -4735,7 +5887,7 @@
       <w:tr>
         <w:tc>
           <w:tcPr>
-            <w:tcW w:type="dxa" w:w="3600"/>
+            <w:tcW w:type="dxa" w:w="3200"/>
             <w:tcBorders>
               <w:top w:val="single" w:color="CCCCCC" w:sz="1"/>
               <w:left w:val="single" w:color="CCCCCC" w:sz="1"/>
@@ -4762,28 +5914,28 @@
         </w:tc>
         <w:tc>
           <w:tcPr>
-            <w:tcW w:type="dxa" w:w="5760"/>
-            <w:tcBorders>
-              <w:top w:val="single" w:color="CCCCCC" w:sz="1"/>
-              <w:left w:val="single" w:color="CCCCCC" w:sz="1"/>
-              <w:bottom w:val="single" w:color="CCCCCC" w:sz="1"/>
-              <w:right w:val="single" w:color="CCCCCC" w:sz="1"/>
-            </w:tcBorders>
-            <w:shd w:fill="FFFFFF" w:val="clear"/>
-            <w:tcMar>
-              <w:top w:type="dxa" w:w="80"/>
-              <w:left w:type="dxa" w:w="120"/>
-              <w:bottom w:type="dxa" w:w="80"/>
-              <w:right w:type="dxa" w:w="120"/>
-            </w:tcMar>
-          </w:tcPr>
-          <w:p>
-            <w:r>
-              <w:rPr>
-                <w:sz w:val="21"/>
-                <w:szCs w:val="21"/>
-              </w:rPr>
-              <w:t xml:space="preserve">Same — insufficient history for 3Y window. 1Y window still computed and served.</w:t>
+            <w:tcW w:type="dxa" w:w="6160"/>
+            <w:tcBorders>
+              <w:top w:val="single" w:color="CCCCCC" w:sz="1"/>
+              <w:left w:val="single" w:color="CCCCCC" w:sz="1"/>
+              <w:bottom w:val="single" w:color="CCCCCC" w:sz="1"/>
+              <w:right w:val="single" w:color="CCCCCC" w:sz="1"/>
+            </w:tcBorders>
+            <w:shd w:fill="FFFFFF" w:val="clear"/>
+            <w:tcMar>
+              <w:top w:type="dxa" w:w="80"/>
+              <w:left w:type="dxa" w:w="120"/>
+              <w:bottom w:type="dxa" w:w="80"/>
+              <w:right w:type="dxa" w:w="120"/>
+            </w:tcMar>
+          </w:tcPr>
+          <w:p>
+            <w:r>
+              <w:rPr>
+                <w:sz w:val="21"/>
+                <w:szCs w:val="21"/>
+              </w:rPr>
+              <w:t xml:space="preserve">Same — insufficient history for 3Y window is handled silently. 1Y and 3Y windows may still be computed and served. Only the windows with insufficient data return 404.</w:t>
             </w:r>
           </w:p>
         </w:tc>
@@ -4791,7 +5943,7 @@
       <w:tr>
         <w:tc>
           <w:tcPr>
-            <w:tcW w:type="dxa" w:w="3600"/>
+            <w:tcW w:type="dxa" w:w="3200"/>
             <w:tcBorders>
               <w:top w:val="single" w:color="CCCCCC" w:sz="1"/>
               <w:left w:val="single" w:color="CCCCCC" w:sz="1"/>
@@ -4818,28 +5970,28 @@
         </w:tc>
         <w:tc>
           <w:tcPr>
-            <w:tcW w:type="dxa" w:w="5760"/>
-            <w:tcBorders>
-              <w:top w:val="single" w:color="CCCCCC" w:sz="1"/>
-              <w:left w:val="single" w:color="CCCCCC" w:sz="1"/>
-              <w:bottom w:val="single" w:color="CCCCCC" w:sz="1"/>
-              <w:right w:val="single" w:color="CCCCCC" w:sz="1"/>
-            </w:tcBorders>
-            <w:shd w:fill="F9FAFB" w:val="clear"/>
-            <w:tcMar>
-              <w:top w:type="dxa" w:w="80"/>
-              <w:left w:type="dxa" w:w="120"/>
-              <w:bottom w:type="dxa" w:w="80"/>
-              <w:right w:type="dxa" w:w="120"/>
-            </w:tcMar>
-          </w:tcPr>
-          <w:p>
-            <w:r>
-              <w:rPr>
-                <w:sz w:val="21"/>
-                <w:szCs w:val="21"/>
-              </w:rPr>
-              <w:t xml:space="preserve">30-day tolerance on start date search. Binary search finds closest available NAV point within 30 days of target date. Gaps up to 30 days are handled transparently.</w:t>
+            <w:tcW w:type="dxa" w:w="6160"/>
+            <w:tcBorders>
+              <w:top w:val="single" w:color="CCCCCC" w:sz="1"/>
+              <w:left w:val="single" w:color="CCCCCC" w:sz="1"/>
+              <w:bottom w:val="single" w:color="CCCCCC" w:sz="1"/>
+              <w:right w:val="single" w:color="CCCCCC" w:sz="1"/>
+            </w:tcBorders>
+            <w:shd w:fill="F9FAFB" w:val="clear"/>
+            <w:tcMar>
+              <w:top w:type="dxa" w:w="80"/>
+              <w:left w:type="dxa" w:w="120"/>
+              <w:bottom w:type="dxa" w:w="80"/>
+              <w:right w:type="dxa" w:w="120"/>
+            </w:tcMar>
+          </w:tcPr>
+          <w:p>
+            <w:r>
+              <w:rPr>
+                <w:sz w:val="21"/>
+                <w:szCs w:val="21"/>
+              </w:rPr>
+              <w:t xml:space="preserve">30-day tolerance on start date search. Binary search finds closest available NAV point within 30 days of target date. Gaps up to 30 days handled transparently.</w:t>
             </w:r>
           </w:p>
         </w:tc>
@@ -4847,7 +5999,7 @@
       <w:tr>
         <w:tc>
           <w:tcPr>
-            <w:tcW w:type="dxa" w:w="3600"/>
+            <w:tcW w:type="dxa" w:w="3200"/>
             <w:tcBorders>
               <w:top w:val="single" w:color="CCCCCC" w:sz="1"/>
               <w:left w:val="single" w:color="CCCCCC" w:sz="1"/>
@@ -4874,7 +6026,7 @@
         </w:tc>
         <w:tc>
           <w:tcPr>
-            <w:tcW w:type="dxa" w:w="5760"/>
+            <w:tcW w:type="dxa" w:w="6160"/>
             <w:tcBorders>
               <w:top w:val="single" w:color="CCCCCC" w:sz="1"/>
               <w:left w:val="single" w:color="CCCCCC" w:sz="1"/>
@@ -4903,7 +6055,7 @@
     </w:tbl>
     <w:p>
       <w:pPr>
-        <w:spacing w:before="120" w:after="80"/>
+        <w:spacing w:before="80" w:after="40"/>
       </w:pPr>
     </w:p>
     <w:p>
@@ -4915,7 +6067,7 @@
           <w:sz w:val="22"/>
           <w:szCs w:val="22"/>
         </w:rPr>
-        <w:t xml:space="preserve">Test verification: TestInsufficientHistory uses 91 days of data for a 1Y window (needs 365 days). Target start date is 274 days before earliest available data — well outside 30-day tolerance. Error returned correctly: "insufficient history for 1Y window: need 365 days, have 91".</w:t>
+        <w:t xml:space="preserve">Test verification: TestInsufficientHistory passes 91 days of data for a 1Y window. Target start date is 274 days before earliest data — well outside 30-day tolerance. Error returned: insufficient history for 1Y window: need 365 days, have 91.</w:t>
       </w:r>
     </w:p>
     <w:p>
@@ -5068,7 +6220,7 @@
                 <w:sz w:val="21"/>
                 <w:szCs w:val="21"/>
               </w:rPr>
-              <w:t xml:space="preserve">Fixed-window token bucket via Redis Lua script. Atomic check+decrement of all three buckets in one round trip. No sliding window — simpler, O(1) Redis ops, TTL anchored to first request. Sufficient for this use case where a small burst at window boundary is acceptable. Survives Go process restarts because state is in Redis not in-process.</w:t>
+              <w:t xml:space="preserve">Fixed-window token bucket via Redis Lua script. Atomic check+decrement of all three buckets in one round trip. Chosen over Go mutex because: state persists across process restarts, works across multiple instances, no TOCTOU race between GET and DECRBY. Chosen over sliding window because O(1) Redis ops with TTL anchored to first request is sufficient — small burst at window boundary is acceptable.</w:t>
             </w:r>
           </w:p>
         </w:tc>
@@ -5124,7 +6276,7 @@
                 <w:sz w:val="21"/>
                 <w:szCs w:val="21"/>
               </w:rPr>
-              <w:t xml:space="preserve">Sequential fetch — one HTTP request per scheme returns full history. mfapi.in has no incremental endpoint so full fetch is unavoidable. With 10 schemes and 300/hour limit, sequential backfill uses 10 requests (3.3% of quota). No need for complex scheduling or batching. Incremental sync filters client-side after comparing against last_nav_date in sync_state.</w:t>
+              <w:t xml:space="preserve">Sequential fetch — one HTTP request per scheme returns full history from mfapi.in. With 10 schemes and 300/hour limit, backfill uses 10 requests (3.3% of quota). No complex scheduling needed. Incremental sync filters client-side after comparing against last_nav_date in sync_state. Pipeline is resumable — crash recovery via sync:in_progress Redis key and sync_state DB table.</w:t>
             </w:r>
           </w:p>
         </w:tc>
@@ -5180,7 +6332,7 @@
                 <w:sz w:val="21"/>
                 <w:szCs w:val="21"/>
               </w:rPr>
-              <w:t xml:space="preserve">TimescaleDB for time-series NAV data — hypertable partitioning makes range queries efficient, standard PostgreSQL compatibility means no new tooling. Redis for pre-computed results — sub-2ms reads under any load, protects TimescaleDB from repeated read pressure. latest NAV stored in funds table (not queried from nav_data) to avoid hypertable chunk scans on hot path.</w:t>
+              <w:t xml:space="preserve">TimescaleDB for time-series NAV data — hypertable partitioning makes range queries efficient, standard PostgreSQL compatibility. Redis for pre-computed results — sub-2ms reads, protects TimescaleDB from read load. current_nav stored in funds table to avoid hypertable chunk scans on the hot GET /funds/:code path.</w:t>
             </w:r>
           </w:p>
         </w:tc>
@@ -5236,7 +6388,7 @@
                 <w:sz w:val="21"/>
                 <w:szCs w:val="21"/>
               </w:rPr>
-              <w:t xml:space="preserve">Two-layer: TimescaleDB as source of truth, Redis as serving layer. Analytics and rankings pre-computed at sync time and stored in Redis with 25hr TTL (refreshed daily by sync). Cache miss falls back to DB batch query, recomputes, warms Redis. GET /funds/:code skips Redis entirely — single PK lookup on funds table is already fast enough.</w:t>
+              <w:t xml:space="preserve">Two-layer: TimescaleDB as source of truth, Redis as serving layer with 25hr TTL. Analytics and rankings pre-computed at sync time. Cache miss falls back to DB batch query, recomputes, warms Redis. GET /funds/:code skips Redis — single PK lookup on funds table is fast enough without caching overhead.</w:t>
             </w:r>
           </w:p>
         </w:tc>
@@ -5292,7 +6444,7 @@
                 <w:sz w:val="21"/>
                 <w:szCs w:val="21"/>
               </w:rPr>
-              <w:t xml:space="preserve">Rate limiter: exponential-style wait based on which bucket is exhausted. Pipeline crash recovery: sync:in_progress Redis key identifies interrupted scheme, sync_state table identifies all incomplete work. Schemes failing 3+ times are skipped. Analytics failures per-window are non-fatal — scheme is still marked complete for other windows. Graceful HTTP shutdown on SIGINT/SIGTERM with 5s timeout.</w:t>
+              <w:t xml:space="preserve">Rate limiter: wait duration based on which bucket is exhausted (500ms / 5s / 5min). Pipeline crash: sync:in_progress identifies interrupted scheme, sync_state identifies all incomplete work. Schemes failing 3+ times skipped. Analytics failures per-window are non-fatal. POST /sync/trigger returns 202 immediately — failures are internal and visible via GET /sync/status. Graceful HTTP shutdown on SIGINT/SIGTERM with 5s timeout.</w:t>
             </w:r>
           </w:p>
         </w:tc>
@@ -5325,7 +6477,7 @@
         <w:sz w:val="18"/>
         <w:szCs w:val="18"/>
       </w:rPr>
-      <w:t xml:space="preserve">Mutual Fund Analytics — Design Decisions  |  Page </w:t>
+      <w:t xml:space="preserve">Mutual Fund Analytics | Design Decisions  |  Page </w:t>
     </w:r>
     <w:r>
       <w:rPr>

</xml_diff>